<commit_message>
docs: simplify CEO handover summary
</commit_message>
<xml_diff>
--- a/docs/handover/웹사이트_인수인계_요약문서.docx
+++ b/docs/handover/웹사이트_인수인계_요약문서.docx
@@ -4,79 +4,77 @@
   <w:body>
     <w:p>
       <w:pPr>
-        <w:spacing w:after="60"/>
+        <w:spacing w:after="160"/>
+        <w:jc w:val="left"/>
       </w:pPr>
       <w:r>
         <w:rPr>
-          <w:rFonts w:ascii="Calibri" w:hAnsi="Calibri" w:eastAsia="Malgun Gothic"/>
+          <w:rFonts w:ascii="Malgun Gothic" w:hAnsi="Malgun Gothic" w:eastAsia="Malgun Gothic"/>
           <w:b/>
-          <w:color w:val="2E74B5"/>
-          <w:sz w:val="44"/>
+          <w:color w:val="1D5C92"/>
+          <w:sz w:val="46"/>
         </w:rPr>
-        <w:t>GreenPutt 웹사이트 인수인계 요약 문서</w:t>
+        <w:t>GreenPutt 웹사이트</w:t>
+        <w:br/>
+        <w:t>사장님용 요약 문서</w:t>
       </w:r>
     </w:p>
     <w:p>
-      <w:pPr>
-        <w:spacing w:after="280"/>
-      </w:pPr>
       <w:r>
         <w:rPr>
-          <w:rFonts w:ascii="Calibri" w:hAnsi="Calibri" w:eastAsia="Malgun Gothic"/>
-          <w:color w:val="5A6068"/>
-          <w:sz w:val="21"/>
+          <w:rFonts w:ascii="Malgun Gothic" w:hAnsi="Malgun Gothic" w:eastAsia="Malgun Gothic"/>
+          <w:b w:val="0"/>
+          <w:color w:val="586069"/>
+          <w:sz w:val="22"/>
         </w:rPr>
-        <w:t>사장님/의사결정자용 요약본 · 최종 정리일 2026-06-10</w:t>
+        <w:t>최종 정리일: 2026-06-10</w:t>
       </w:r>
     </w:p>
     <w:tbl>
       <w:tblPr>
         <w:tblStyle w:val="TableGrid"/>
-        <w:tblW w:type="dxa" w:w="9120"/>
+        <w:tblW w:type="dxa" w:w="9600"/>
         <w:jc w:val="left"/>
         <w:tblLayout w:type="fixed"/>
         <w:tblLook w:firstColumn="1" w:firstRow="1" w:lastColumn="0" w:lastRow="0" w:noHBand="0" w:noVBand="1" w:val="04A0"/>
-        <w:tblInd w:w="120" w:type="dxa"/>
+        <w:tblInd w:w="80" w:type="dxa"/>
       </w:tblPr>
       <w:tblGrid>
-        <w:gridCol w:w="9120"/>
+        <w:gridCol w:w="9600"/>
       </w:tblGrid>
       <w:tr>
         <w:tc>
           <w:tcPr>
-            <w:tcW w:type="dxa" w:w="9120"/>
+            <w:tcW w:type="dxa" w:w="9600"/>
             <w:vAlign w:val="center"/>
             <w:tcMar>
-              <w:top w:w="80" w:type="dxa"/>
-              <w:start w:w="120" w:type="dxa"/>
-              <w:bottom w:w="80" w:type="dxa"/>
-              <w:end w:w="120" w:type="dxa"/>
+              <w:top w:w="120" w:type="dxa"/>
+              <w:start w:w="140" w:type="dxa"/>
+              <w:bottom w:w="120" w:type="dxa"/>
+              <w:end w:w="140" w:type="dxa"/>
             </w:tcMar>
-            <w:shd w:fill="EAF2F8"/>
+            <w:shd w:fill="EEF5FB"/>
           </w:tcPr>
           <w:p>
-            <w:pPr>
-              <w:spacing w:after="80"/>
-            </w:pPr>
             <w:r/>
             <w:r>
               <w:rPr>
-                <w:rFonts w:ascii="Calibri" w:hAnsi="Calibri" w:eastAsia="Malgun Gothic"/>
+                <w:rFonts w:ascii="Malgun Gothic" w:hAnsi="Malgun Gothic" w:eastAsia="Malgun Gothic"/>
                 <w:b/>
-                <w:color w:val="1F4D78"/>
+                <w:color w:val="1D5C92"/>
+                <w:sz w:val="26"/>
               </w:rPr>
-              <w:t>핵심 결론</w:t>
+              <w:t>한 줄 요약</w:t>
             </w:r>
           </w:p>
           <w:p>
-            <w:pPr>
-              <w:spacing w:after="0"/>
-            </w:pPr>
             <w:r>
               <w:rPr>
-                <w:rFonts w:ascii="Calibri" w:hAnsi="Calibri" w:eastAsia="Malgun Gothic"/>
+                <w:rFonts w:ascii="Malgun Gothic" w:hAnsi="Malgun Gothic" w:eastAsia="Malgun Gothic"/>
+                <w:b w:val="0"/>
+                <w:sz w:val="25"/>
               </w:rPr>
-              <w:t>전달된 소스는 고객에게 보여줄 GreenPutt 브랜드 홈페이지입니다. 결제, 주문, 회원, 배송, 고객센터는 기존처럼 아임웹에서 운영합니다. 고객이 실제로 접속하려면 임시 주소에 먼저 배포해 확인한 뒤, 필요하면 greenputt.kr 도메인 연결을 결정하면 됩니다.</w:t>
+              <w:t>새 홈페이지는 고객이 처음 보는 “쇼윈도”이고, 결제와 주문 처리는 기존처럼 아임웹이 맡습니다. 사장님은 임시 주소로 화면을 확인한 뒤, greenputt.kr에 연결할지만 결정하시면 됩니다.</w:t>
             </w:r>
           </w:p>
         </w:tc>
@@ -88,40 +86,74 @@
         <w:pStyle w:val="Heading1"/>
       </w:pPr>
       <w:r>
-        <w:t>1. 한눈에 보는 현재 상태</w:t>
+        <w:t>1. 현재 열어볼 수 있는 주소</w:t>
       </w:r>
     </w:p>
     <w:p>
       <w:r>
-        <w:t>GreenPutt 웹사이트는 고객이 보는 브랜드 화면과 실제 쇼핑몰 운영 공간이 분리된 구조입니다.</w:t>
+        <w:rPr>
+          <w:rFonts w:ascii="Malgun Gothic" w:hAnsi="Malgun Gothic" w:eastAsia="Malgun Gothic"/>
+          <w:b w:val="0"/>
+          <w:sz w:val="25"/>
+        </w:rPr>
+        <w:t>아래 주소에서 현재 만들어둔 GreenPutt 홈페이지를 참고로 볼 수 있습니다.</w:t>
+      </w:r>
+    </w:p>
+    <w:p>
+      <w:r>
+        <w:rPr>
+          <w:rFonts w:ascii="Malgun Gothic" w:hAnsi="Malgun Gothic" w:eastAsia="Malgun Gothic"/>
+          <w:b/>
+          <w:color w:val="1D5C92"/>
+          <w:sz w:val="26"/>
+        </w:rPr>
+        <w:t>https://micaelclaw.github.io/greenputt-website-test/</w:t>
+      </w:r>
+    </w:p>
+    <w:p>
+      <w:r>
+        <w:rPr>
+          <w:rFonts w:ascii="Malgun Gothic" w:hAnsi="Malgun Gothic" w:eastAsia="Malgun Gothic"/>
+          <w:b w:val="0"/>
+          <w:sz w:val="25"/>
+        </w:rPr>
+        <w:t>이 주소는 최종 운영 주소가 아니라, 화면 확인용 미리보기 주소입니다.</w:t>
+      </w:r>
+    </w:p>
+    <w:p>
+      <w:pPr>
+        <w:pStyle w:val="Heading1"/>
+      </w:pPr>
+      <w:r>
+        <w:t>2. 웹사이트 구조를 쉽게 보면</w:t>
       </w:r>
     </w:p>
     <w:tbl>
       <w:tblPr>
         <w:tblStyle w:val="TableGrid"/>
-        <w:tblW w:type="dxa" w:w="9320"/>
+        <w:tblW w:type="dxa" w:w="9600"/>
         <w:tblLayout w:type="fixed"/>
         <w:tblLook w:firstColumn="1" w:firstRow="1" w:lastColumn="0" w:lastRow="0" w:noHBand="0" w:noVBand="1" w:val="04A0"/>
         <w:jc w:val="left"/>
-        <w:tblInd w:w="120" w:type="dxa"/>
+        <w:tblInd w:w="80" w:type="dxa"/>
       </w:tblPr>
       <w:tblGrid>
-        <w:gridCol w:w="1900"/>
-        <w:gridCol w:w="2700"/>
-        <w:gridCol w:w="4720"/>
+        <w:gridCol w:w="1800"/>
+        <w:gridCol w:w="3000"/>
+        <w:gridCol w:w="4800"/>
       </w:tblGrid>
       <w:tr>
         <w:tc>
           <w:tcPr>
-            <w:tcW w:type="dxa" w:w="1900"/>
+            <w:tcW w:type="dxa" w:w="1800"/>
             <w:vAlign w:val="center"/>
             <w:tcMar>
-              <w:top w:w="80" w:type="dxa"/>
-              <w:start w:w="120" w:type="dxa"/>
-              <w:bottom w:w="80" w:type="dxa"/>
-              <w:end w:w="120" w:type="dxa"/>
+              <w:top w:w="120" w:type="dxa"/>
+              <w:start w:w="140" w:type="dxa"/>
+              <w:bottom w:w="120" w:type="dxa"/>
+              <w:end w:w="140" w:type="dxa"/>
             </w:tcMar>
-            <w:shd w:fill="F2F4F7"/>
+            <w:shd w:fill="E7EEF6"/>
           </w:tcPr>
           <w:p>
             <w:pPr>
@@ -129,8 +161,10 @@
             </w:pPr>
             <w:r>
               <w:rPr>
-                <w:rFonts w:ascii="Calibri" w:hAnsi="Calibri" w:eastAsia="Malgun Gothic"/>
+                <w:rFonts w:ascii="Malgun Gothic" w:hAnsi="Malgun Gothic" w:eastAsia="Malgun Gothic"/>
                 <w:b/>
+                <w:color w:val="1F3040"/>
+                <w:sz w:val="23"/>
               </w:rPr>
               <w:t>구분</w:t>
             </w:r>
@@ -138,15 +172,15 @@
         </w:tc>
         <w:tc>
           <w:tcPr>
-            <w:tcW w:type="dxa" w:w="2700"/>
+            <w:tcW w:type="dxa" w:w="3000"/>
             <w:vAlign w:val="center"/>
             <w:tcMar>
-              <w:top w:w="80" w:type="dxa"/>
-              <w:start w:w="120" w:type="dxa"/>
-              <w:bottom w:w="80" w:type="dxa"/>
-              <w:end w:w="120" w:type="dxa"/>
+              <w:top w:w="120" w:type="dxa"/>
+              <w:start w:w="140" w:type="dxa"/>
+              <w:bottom w:w="120" w:type="dxa"/>
+              <w:end w:w="140" w:type="dxa"/>
             </w:tcMar>
-            <w:shd w:fill="F2F4F7"/>
+            <w:shd w:fill="E7EEF6"/>
           </w:tcPr>
           <w:p>
             <w:pPr>
@@ -154,8 +188,10 @@
             </w:pPr>
             <w:r>
               <w:rPr>
-                <w:rFonts w:ascii="Calibri" w:hAnsi="Calibri" w:eastAsia="Malgun Gothic"/>
+                <w:rFonts w:ascii="Malgun Gothic" w:hAnsi="Malgun Gothic" w:eastAsia="Malgun Gothic"/>
                 <w:b/>
+                <w:color w:val="1F3040"/>
+                <w:sz w:val="23"/>
               </w:rPr>
               <w:t>쉽게 말하면</w:t>
             </w:r>
@@ -163,15 +199,15 @@
         </w:tc>
         <w:tc>
           <w:tcPr>
-            <w:tcW w:type="dxa" w:w="4720"/>
+            <w:tcW w:type="dxa" w:w="4800"/>
             <w:vAlign w:val="center"/>
             <w:tcMar>
-              <w:top w:w="80" w:type="dxa"/>
-              <w:start w:w="120" w:type="dxa"/>
-              <w:bottom w:w="80" w:type="dxa"/>
-              <w:end w:w="120" w:type="dxa"/>
+              <w:top w:w="120" w:type="dxa"/>
+              <w:start w:w="140" w:type="dxa"/>
+              <w:bottom w:w="120" w:type="dxa"/>
+              <w:end w:w="140" w:type="dxa"/>
             </w:tcMar>
-            <w:shd w:fill="F2F4F7"/>
+            <w:shd w:fill="E7EEF6"/>
           </w:tcPr>
           <w:p>
             <w:pPr>
@@ -179,10 +215,12 @@
             </w:pPr>
             <w:r>
               <w:rPr>
-                <w:rFonts w:ascii="Calibri" w:hAnsi="Calibri" w:eastAsia="Malgun Gothic"/>
+                <w:rFonts w:ascii="Malgun Gothic" w:hAnsi="Malgun Gothic" w:eastAsia="Malgun Gothic"/>
                 <w:b/>
+                <w:color w:val="1F3040"/>
+                <w:sz w:val="23"/>
               </w:rPr>
-              <w:t>현재 역할</w:t>
+              <w:t>역할</w:t>
             </w:r>
           </w:p>
         </w:tc>
@@ -190,13 +228,13 @@
       <w:tr>
         <w:tc>
           <w:tcPr>
-            <w:tcW w:type="dxa" w:w="1900"/>
+            <w:tcW w:type="dxa" w:w="1800"/>
             <w:vAlign w:val="center"/>
             <w:tcMar>
-              <w:top w:w="80" w:type="dxa"/>
-              <w:start w:w="120" w:type="dxa"/>
-              <w:bottom w:w="80" w:type="dxa"/>
-              <w:end w:w="120" w:type="dxa"/>
+              <w:top w:w="120" w:type="dxa"/>
+              <w:start w:w="140" w:type="dxa"/>
+              <w:bottom w:w="120" w:type="dxa"/>
+              <w:end w:w="140" w:type="dxa"/>
             </w:tcMar>
           </w:tcPr>
           <w:p>
@@ -205,22 +243,23 @@
             </w:pPr>
             <w:r>
               <w:rPr>
-                <w:rFonts w:ascii="Calibri" w:hAnsi="Calibri" w:eastAsia="Malgun Gothic"/>
-                <w:sz w:val="21"/>
+                <w:rFonts w:ascii="Malgun Gothic" w:hAnsi="Malgun Gothic" w:eastAsia="Malgun Gothic"/>
+                <w:b w:val="0"/>
+                <w:sz w:val="23"/>
               </w:rPr>
-              <w:t>커스텀 홈페이지</w:t>
+              <w:t>새 홈페이지</w:t>
             </w:r>
           </w:p>
         </w:tc>
         <w:tc>
           <w:tcPr>
-            <w:tcW w:type="dxa" w:w="2700"/>
+            <w:tcW w:type="dxa" w:w="3000"/>
             <w:vAlign w:val="center"/>
             <w:tcMar>
-              <w:top w:w="80" w:type="dxa"/>
-              <w:start w:w="120" w:type="dxa"/>
-              <w:bottom w:w="80" w:type="dxa"/>
-              <w:end w:w="120" w:type="dxa"/>
+              <w:top w:w="120" w:type="dxa"/>
+              <w:start w:w="140" w:type="dxa"/>
+              <w:bottom w:w="120" w:type="dxa"/>
+              <w:end w:w="140" w:type="dxa"/>
             </w:tcMar>
           </w:tcPr>
           <w:p>
@@ -229,22 +268,23 @@
             </w:pPr>
             <w:r>
               <w:rPr>
-                <w:rFonts w:ascii="Calibri" w:hAnsi="Calibri" w:eastAsia="Malgun Gothic"/>
-                <w:sz w:val="21"/>
+                <w:rFonts w:ascii="Malgun Gothic" w:hAnsi="Malgun Gothic" w:eastAsia="Malgun Gothic"/>
+                <w:b w:val="0"/>
+                <w:sz w:val="23"/>
               </w:rPr>
-              <w:t>고객이 처음 보는 브랜드 화면</w:t>
+              <w:t>매장 앞 쇼윈도</w:t>
             </w:r>
           </w:p>
         </w:tc>
         <w:tc>
           <w:tcPr>
-            <w:tcW w:type="dxa" w:w="4720"/>
+            <w:tcW w:type="dxa" w:w="4800"/>
             <w:vAlign w:val="center"/>
             <w:tcMar>
-              <w:top w:w="80" w:type="dxa"/>
-              <w:start w:w="120" w:type="dxa"/>
-              <w:bottom w:w="80" w:type="dxa"/>
-              <w:end w:w="120" w:type="dxa"/>
+              <w:top w:w="120" w:type="dxa"/>
+              <w:start w:w="140" w:type="dxa"/>
+              <w:bottom w:w="120" w:type="dxa"/>
+              <w:end w:w="140" w:type="dxa"/>
             </w:tcMar>
           </w:tcPr>
           <w:p>
@@ -253,10 +293,11 @@
             </w:pPr>
             <w:r>
               <w:rPr>
-                <w:rFonts w:ascii="Calibri" w:hAnsi="Calibri" w:eastAsia="Malgun Gothic"/>
-                <w:sz w:val="21"/>
+                <w:rFonts w:ascii="Malgun Gothic" w:hAnsi="Malgun Gothic" w:eastAsia="Malgun Gothic"/>
+                <w:b w:val="0"/>
+                <w:sz w:val="23"/>
               </w:rPr>
-              <w:t>GreenPutt 소개, 펏트너(PUTTNER) 제품 스토리, Polvert 구매 연결</w:t>
+              <w:t>브랜드 소개, 제품 소개, Polvert 구매 버튼</w:t>
             </w:r>
           </w:p>
         </w:tc>
@@ -264,13 +305,13 @@
       <w:tr>
         <w:tc>
           <w:tcPr>
-            <w:tcW w:type="dxa" w:w="1900"/>
+            <w:tcW w:type="dxa" w:w="1800"/>
             <w:vAlign w:val="center"/>
             <w:tcMar>
-              <w:top w:w="80" w:type="dxa"/>
-              <w:start w:w="120" w:type="dxa"/>
-              <w:bottom w:w="80" w:type="dxa"/>
-              <w:end w:w="120" w:type="dxa"/>
+              <w:top w:w="120" w:type="dxa"/>
+              <w:start w:w="140" w:type="dxa"/>
+              <w:bottom w:w="120" w:type="dxa"/>
+              <w:end w:w="140" w:type="dxa"/>
             </w:tcMar>
           </w:tcPr>
           <w:p>
@@ -279,8 +320,9 @@
             </w:pPr>
             <w:r>
               <w:rPr>
-                <w:rFonts w:ascii="Calibri" w:hAnsi="Calibri" w:eastAsia="Malgun Gothic"/>
-                <w:sz w:val="21"/>
+                <w:rFonts w:ascii="Malgun Gothic" w:hAnsi="Malgun Gothic" w:eastAsia="Malgun Gothic"/>
+                <w:b w:val="0"/>
+                <w:sz w:val="23"/>
               </w:rPr>
               <w:t>아임웹</w:t>
             </w:r>
@@ -288,13 +330,13 @@
         </w:tc>
         <w:tc>
           <w:tcPr>
-            <w:tcW w:type="dxa" w:w="2700"/>
+            <w:tcW w:type="dxa" w:w="3000"/>
             <w:vAlign w:val="center"/>
             <w:tcMar>
-              <w:top w:w="80" w:type="dxa"/>
-              <w:start w:w="120" w:type="dxa"/>
-              <w:bottom w:w="80" w:type="dxa"/>
-              <w:end w:w="120" w:type="dxa"/>
+              <w:top w:w="120" w:type="dxa"/>
+              <w:start w:w="140" w:type="dxa"/>
+              <w:bottom w:w="120" w:type="dxa"/>
+              <w:end w:w="140" w:type="dxa"/>
             </w:tcMar>
           </w:tcPr>
           <w:p>
@@ -303,22 +345,23 @@
             </w:pPr>
             <w:r>
               <w:rPr>
-                <w:rFonts w:ascii="Calibri" w:hAnsi="Calibri" w:eastAsia="Malgun Gothic"/>
-                <w:sz w:val="21"/>
+                <w:rFonts w:ascii="Malgun Gothic" w:hAnsi="Malgun Gothic" w:eastAsia="Malgun Gothic"/>
+                <w:b w:val="0"/>
+                <w:sz w:val="23"/>
               </w:rPr>
-              <w:t>실제 쇼핑몰 운영 공간</w:t>
+              <w:t>계산대와 주문 장부</w:t>
             </w:r>
           </w:p>
         </w:tc>
         <w:tc>
           <w:tcPr>
-            <w:tcW w:type="dxa" w:w="4720"/>
+            <w:tcW w:type="dxa" w:w="4800"/>
             <w:vAlign w:val="center"/>
             <w:tcMar>
-              <w:top w:w="80" w:type="dxa"/>
-              <w:start w:w="120" w:type="dxa"/>
-              <w:bottom w:w="80" w:type="dxa"/>
-              <w:end w:w="120" w:type="dxa"/>
+              <w:top w:w="120" w:type="dxa"/>
+              <w:start w:w="140" w:type="dxa"/>
+              <w:bottom w:w="120" w:type="dxa"/>
+              <w:end w:w="140" w:type="dxa"/>
             </w:tcMar>
           </w:tcPr>
           <w:p>
@@ -327,10 +370,613 @@
             </w:pPr>
             <w:r>
               <w:rPr>
-                <w:rFonts w:ascii="Calibri" w:hAnsi="Calibri" w:eastAsia="Malgun Gothic"/>
-                <w:sz w:val="21"/>
+                <w:rFonts w:ascii="Malgun Gothic" w:hAnsi="Malgun Gothic" w:eastAsia="Malgun Gothic"/>
+                <w:b w:val="0"/>
+                <w:sz w:val="23"/>
               </w:rPr>
-              <w:t>상품 구매, 장바구니, 결제, 회원, 주문, 배송, 고객센터</w:t>
+              <w:t>결제, 주문, 회원, 배송, 고객센터</w:t>
+            </w:r>
+          </w:p>
+        </w:tc>
+      </w:tr>
+    </w:tbl>
+    <w:p/>
+    <w:p>
+      <w:r>
+        <w:rPr>
+          <w:rFonts w:ascii="Malgun Gothic" w:hAnsi="Malgun Gothic" w:eastAsia="Malgun Gothic"/>
+          <w:b w:val="0"/>
+          <w:sz w:val="25"/>
+        </w:rPr>
+        <w:t>새 홈페이지를 쓰더라도 결제와 주문 관리는 기존 아임웹을 계속 사용합니다.</w:t>
+      </w:r>
+    </w:p>
+    <w:p>
+      <w:pPr>
+        <w:pStyle w:val="Heading1"/>
+      </w:pPr>
+      <w:r>
+        <w:t>3. 이번에 넘겨주는 자료</w:t>
+      </w:r>
+    </w:p>
+    <w:p>
+      <w:pPr>
+        <w:pStyle w:val="ListBullet"/>
+        <w:spacing w:after="140"/>
+        <w:ind w:left="504" w:hanging="259"/>
+      </w:pPr>
+      <w:r>
+        <w:rPr>
+          <w:rFonts w:ascii="Malgun Gothic" w:hAnsi="Malgun Gothic" w:eastAsia="Malgun Gothic"/>
+          <w:b w:val="0"/>
+          <w:sz w:val="25"/>
+        </w:rPr>
+        <w:t>새 GreenPutt 홈페이지 파일</w:t>
+      </w:r>
+    </w:p>
+    <w:p>
+      <w:pPr>
+        <w:pStyle w:val="ListBullet"/>
+        <w:spacing w:after="140"/>
+        <w:ind w:left="504" w:hanging="259"/>
+      </w:pPr>
+      <w:r>
+        <w:rPr>
+          <w:rFonts w:ascii="Malgun Gothic" w:hAnsi="Malgun Gothic" w:eastAsia="Malgun Gothic"/>
+          <w:b w:val="0"/>
+          <w:sz w:val="25"/>
+        </w:rPr>
+        <w:t>홈페이지에 들어간 이미지와 로고</w:t>
+      </w:r>
+    </w:p>
+    <w:p>
+      <w:pPr>
+        <w:pStyle w:val="ListBullet"/>
+        <w:spacing w:after="140"/>
+        <w:ind w:left="504" w:hanging="259"/>
+      </w:pPr>
+      <w:r>
+        <w:rPr>
+          <w:rFonts w:ascii="Malgun Gothic" w:hAnsi="Malgun Gothic" w:eastAsia="Malgun Gothic"/>
+          <w:b w:val="0"/>
+          <w:sz w:val="25"/>
+        </w:rPr>
+        <w:t>Polvert 장갑 상품 자료</w:t>
+      </w:r>
+    </w:p>
+    <w:p>
+      <w:pPr>
+        <w:pStyle w:val="ListBullet"/>
+        <w:spacing w:after="140"/>
+        <w:ind w:left="504" w:hanging="259"/>
+      </w:pPr>
+      <w:r>
+        <w:rPr>
+          <w:rFonts w:ascii="Malgun Gothic" w:hAnsi="Malgun Gothic" w:eastAsia="Malgun Gothic"/>
+          <w:b w:val="0"/>
+          <w:sz w:val="25"/>
+        </w:rPr>
+        <w:t>가비아 도메인 자료와 아임웹 참고 자료</w:t>
+      </w:r>
+    </w:p>
+    <w:p>
+      <w:pPr>
+        <w:pStyle w:val="ListBullet"/>
+        <w:spacing w:after="140"/>
+        <w:ind w:left="504" w:hanging="259"/>
+      </w:pPr>
+      <w:r>
+        <w:rPr>
+          <w:rFonts w:ascii="Malgun Gothic" w:hAnsi="Malgun Gothic" w:eastAsia="Malgun Gothic"/>
+          <w:b w:val="0"/>
+          <w:sz w:val="25"/>
+        </w:rPr>
+        <w:t>외주 담당자에게 바로 공유할 06_외주_담당자_전달자료 폴더</w:t>
+      </w:r>
+    </w:p>
+    <w:p>
+      <w:r>
+        <w:rPr>
+          <w:rFonts w:ascii="Malgun Gothic" w:hAnsi="Malgun Gothic" w:eastAsia="Malgun Gothic"/>
+          <w:b w:val="0"/>
+          <w:sz w:val="25"/>
+        </w:rPr>
+        <w:t>비밀번호는 문서와 ZIP 파일 안에 넣지 않았습니다. 가비아와 아임웹 비밀번호는 별도로 전달하는 것이 안전합니다.</w:t>
+      </w:r>
+    </w:p>
+    <w:p>
+      <w:pPr>
+        <w:pStyle w:val="Heading1"/>
+      </w:pPr>
+      <w:r>
+        <w:t>4. 사장님이 직접 하실 필요 없는 일</w:t>
+      </w:r>
+    </w:p>
+    <w:p>
+      <w:pPr>
+        <w:pStyle w:val="ListBullet"/>
+        <w:spacing w:after="140"/>
+        <w:ind w:left="504" w:hanging="259"/>
+      </w:pPr>
+      <w:r>
+        <w:rPr>
+          <w:rFonts w:ascii="Malgun Gothic" w:hAnsi="Malgun Gothic" w:eastAsia="Malgun Gothic"/>
+          <w:b w:val="0"/>
+          <w:sz w:val="25"/>
+        </w:rPr>
+        <w:t>소스 파일을 여는 일</w:t>
+      </w:r>
+    </w:p>
+    <w:p>
+      <w:pPr>
+        <w:pStyle w:val="ListBullet"/>
+        <w:spacing w:after="140"/>
+        <w:ind w:left="504" w:hanging="259"/>
+      </w:pPr>
+      <w:r>
+        <w:rPr>
+          <w:rFonts w:ascii="Malgun Gothic" w:hAnsi="Malgun Gothic" w:eastAsia="Malgun Gothic"/>
+          <w:b w:val="0"/>
+          <w:sz w:val="25"/>
+        </w:rPr>
+        <w:t>홈페이지를 인터넷에 올리는 일</w:t>
+      </w:r>
+    </w:p>
+    <w:p>
+      <w:pPr>
+        <w:pStyle w:val="ListBullet"/>
+        <w:spacing w:after="140"/>
+        <w:ind w:left="504" w:hanging="259"/>
+      </w:pPr>
+      <w:r>
+        <w:rPr>
+          <w:rFonts w:ascii="Malgun Gothic" w:hAnsi="Malgun Gothic" w:eastAsia="Malgun Gothic"/>
+          <w:b w:val="0"/>
+          <w:sz w:val="25"/>
+        </w:rPr>
+        <w:t>PC와 휴대폰 화면을 기술적으로 점검하는 일</w:t>
+      </w:r>
+    </w:p>
+    <w:p>
+      <w:pPr>
+        <w:pStyle w:val="ListBullet"/>
+        <w:spacing w:after="140"/>
+        <w:ind w:left="504" w:hanging="259"/>
+      </w:pPr>
+      <w:r>
+        <w:rPr>
+          <w:rFonts w:ascii="Malgun Gothic" w:hAnsi="Malgun Gothic" w:eastAsia="Malgun Gothic"/>
+          <w:b w:val="0"/>
+          <w:sz w:val="25"/>
+        </w:rPr>
+        <w:t>구매 버튼 연결을 테스트하는 일</w:t>
+      </w:r>
+    </w:p>
+    <w:p>
+      <w:pPr>
+        <w:pStyle w:val="ListBullet"/>
+        <w:spacing w:after="140"/>
+        <w:ind w:left="504" w:hanging="259"/>
+      </w:pPr>
+      <w:r>
+        <w:rPr>
+          <w:rFonts w:ascii="Malgun Gothic" w:hAnsi="Malgun Gothic" w:eastAsia="Malgun Gothic"/>
+          <w:b w:val="0"/>
+          <w:sz w:val="25"/>
+        </w:rPr>
+        <w:t>도메인 연결 전 DNS를 백업하는 일</w:t>
+      </w:r>
+    </w:p>
+    <w:p>
+      <w:r>
+        <w:rPr>
+          <w:rFonts w:ascii="Malgun Gothic" w:hAnsi="Malgun Gothic" w:eastAsia="Malgun Gothic"/>
+          <w:b w:val="0"/>
+          <w:sz w:val="25"/>
+        </w:rPr>
+        <w:t>위 작업은 외주 담당자나 실무자가 처리하면 됩니다.</w:t>
+      </w:r>
+    </w:p>
+    <w:p>
+      <w:pPr>
+        <w:pStyle w:val="Heading1"/>
+      </w:pPr>
+      <w:r>
+        <w:t>5. 외주 담당자에게 맡길 일</w:t>
+      </w:r>
+    </w:p>
+    <w:p>
+      <w:r>
+        <w:rPr>
+          <w:rFonts w:ascii="Malgun Gothic" w:hAnsi="Malgun Gothic" w:eastAsia="Malgun Gothic"/>
+          <w:b w:val="0"/>
+          <w:sz w:val="25"/>
+        </w:rPr>
+        <w:t>외주 담당자에게는 먼저 아래 폴더만 공유하면 됩니다.</w:t>
+      </w:r>
+    </w:p>
+    <w:p>
+      <w:r>
+        <w:rPr>
+          <w:rFonts w:ascii="Malgun Gothic" w:hAnsi="Malgun Gothic" w:eastAsia="Malgun Gothic"/>
+          <w:b/>
+          <w:color w:val="1D5C92"/>
+          <w:sz w:val="26"/>
+        </w:rPr>
+        <w:t>06_외주_담당자_전달자료</w:t>
+      </w:r>
+    </w:p>
+    <w:p>
+      <w:pPr>
+        <w:pStyle w:val="ListNumber"/>
+        <w:spacing w:after="140"/>
+        <w:ind w:left="547" w:hanging="288"/>
+      </w:pPr>
+      <w:r>
+        <w:rPr>
+          <w:rFonts w:ascii="Malgun Gothic" w:hAnsi="Malgun Gothic" w:eastAsia="Malgun Gothic"/>
+          <w:b w:val="0"/>
+          <w:sz w:val="25"/>
+        </w:rPr>
+        <w:t>안내문을 먼저 확인해 주세요.</w:t>
+      </w:r>
+    </w:p>
+    <w:p>
+      <w:pPr>
+        <w:pStyle w:val="ListNumber"/>
+        <w:spacing w:after="140"/>
+        <w:ind w:left="547" w:hanging="288"/>
+      </w:pPr>
+      <w:r>
+        <w:rPr>
+          <w:rFonts w:ascii="Malgun Gothic" w:hAnsi="Malgun Gothic" w:eastAsia="Malgun Gothic"/>
+          <w:b w:val="0"/>
+          <w:sz w:val="25"/>
+        </w:rPr>
+        <w:t>홈페이지 소스 ZIP을 열어 화면을 확인해 주세요.</w:t>
+      </w:r>
+    </w:p>
+    <w:p>
+      <w:pPr>
+        <w:pStyle w:val="ListNumber"/>
+        <w:spacing w:after="140"/>
+        <w:ind w:left="547" w:hanging="288"/>
+      </w:pPr>
+      <w:r>
+        <w:rPr>
+          <w:rFonts w:ascii="Malgun Gothic" w:hAnsi="Malgun Gothic" w:eastAsia="Malgun Gothic"/>
+          <w:b w:val="0"/>
+          <w:sz w:val="25"/>
+        </w:rPr>
+        <w:t>임시 확인 주소를 만들어 주세요.</w:t>
+      </w:r>
+    </w:p>
+    <w:p>
+      <w:pPr>
+        <w:pStyle w:val="ListNumber"/>
+        <w:spacing w:after="140"/>
+        <w:ind w:left="547" w:hanging="288"/>
+      </w:pPr>
+      <w:r>
+        <w:rPr>
+          <w:rFonts w:ascii="Malgun Gothic" w:hAnsi="Malgun Gothic" w:eastAsia="Malgun Gothic"/>
+          <w:b w:val="0"/>
+          <w:sz w:val="25"/>
+        </w:rPr>
+        <w:t>PC와 휴대폰에서 화면이 잘 보이는지 봐주세요.</w:t>
+      </w:r>
+    </w:p>
+    <w:p>
+      <w:pPr>
+        <w:pStyle w:val="ListNumber"/>
+        <w:spacing w:after="140"/>
+        <w:ind w:left="547" w:hanging="288"/>
+      </w:pPr>
+      <w:r>
+        <w:rPr>
+          <w:rFonts w:ascii="Malgun Gothic" w:hAnsi="Malgun Gothic" w:eastAsia="Malgun Gothic"/>
+          <w:b w:val="0"/>
+          <w:sz w:val="25"/>
+        </w:rPr>
+        <w:t>Polvert 구매 버튼이 아임웹으로 잘 연결되는지 확인해 주세요.</w:t>
+      </w:r>
+    </w:p>
+    <w:p>
+      <w:pPr>
+        <w:pStyle w:val="ListNumber"/>
+        <w:spacing w:after="140"/>
+        <w:ind w:left="547" w:hanging="288"/>
+      </w:pPr>
+      <w:r>
+        <w:rPr>
+          <w:rFonts w:ascii="Malgun Gothic" w:hAnsi="Malgun Gothic" w:eastAsia="Malgun Gothic"/>
+          <w:b w:val="0"/>
+          <w:sz w:val="25"/>
+        </w:rPr>
+        <w:t>문제가 없으면 greenputt.kr 연결 방법을 제안해 주세요.</w:t>
+      </w:r>
+    </w:p>
+    <w:p>
+      <w:pPr>
+        <w:pStyle w:val="Heading1"/>
+      </w:pPr>
+      <w:r>
+        <w:t>6. 사장님이 결정할 일</w:t>
+      </w:r>
+    </w:p>
+    <w:tbl>
+      <w:tblPr>
+        <w:tblStyle w:val="TableGrid"/>
+        <w:tblW w:type="dxa" w:w="9600"/>
+        <w:tblLayout w:type="fixed"/>
+        <w:tblLook w:firstColumn="1" w:firstRow="1" w:lastColumn="0" w:lastRow="0" w:noHBand="0" w:noVBand="1" w:val="04A0"/>
+        <w:jc w:val="left"/>
+        <w:tblInd w:w="80" w:type="dxa"/>
+      </w:tblPr>
+      <w:tblGrid>
+        <w:gridCol w:w="2500"/>
+        <w:gridCol w:w="7100"/>
+      </w:tblGrid>
+      <w:tr>
+        <w:tc>
+          <w:tcPr>
+            <w:tcW w:type="dxa" w:w="2500"/>
+            <w:vAlign w:val="center"/>
+            <w:tcMar>
+              <w:top w:w="120" w:type="dxa"/>
+              <w:start w:w="140" w:type="dxa"/>
+              <w:bottom w:w="120" w:type="dxa"/>
+              <w:end w:w="140" w:type="dxa"/>
+            </w:tcMar>
+            <w:shd w:fill="E7EEF6"/>
+          </w:tcPr>
+          <w:p>
+            <w:pPr>
+              <w:spacing w:after="0"/>
+            </w:pPr>
+            <w:r>
+              <w:rPr>
+                <w:rFonts w:ascii="Malgun Gothic" w:hAnsi="Malgun Gothic" w:eastAsia="Malgun Gothic"/>
+                <w:b/>
+                <w:color w:val="1F3040"/>
+                <w:sz w:val="23"/>
+              </w:rPr>
+              <w:t>결정할 일</w:t>
+            </w:r>
+          </w:p>
+        </w:tc>
+        <w:tc>
+          <w:tcPr>
+            <w:tcW w:type="dxa" w:w="7100"/>
+            <w:vAlign w:val="center"/>
+            <w:tcMar>
+              <w:top w:w="120" w:type="dxa"/>
+              <w:start w:w="140" w:type="dxa"/>
+              <w:bottom w:w="120" w:type="dxa"/>
+              <w:end w:w="140" w:type="dxa"/>
+            </w:tcMar>
+            <w:shd w:fill="E7EEF6"/>
+          </w:tcPr>
+          <w:p>
+            <w:pPr>
+              <w:spacing w:after="0"/>
+            </w:pPr>
+            <w:r>
+              <w:rPr>
+                <w:rFonts w:ascii="Malgun Gothic" w:hAnsi="Malgun Gothic" w:eastAsia="Malgun Gothic"/>
+                <w:b/>
+                <w:color w:val="1F3040"/>
+                <w:sz w:val="23"/>
+              </w:rPr>
+              <w:t>쉽게 말하면</w:t>
+            </w:r>
+          </w:p>
+        </w:tc>
+      </w:tr>
+      <w:tr>
+        <w:tc>
+          <w:tcPr>
+            <w:tcW w:type="dxa" w:w="2500"/>
+            <w:vAlign w:val="center"/>
+            <w:tcMar>
+              <w:top w:w="120" w:type="dxa"/>
+              <w:start w:w="140" w:type="dxa"/>
+              <w:bottom w:w="120" w:type="dxa"/>
+              <w:end w:w="140" w:type="dxa"/>
+            </w:tcMar>
+          </w:tcPr>
+          <w:p>
+            <w:pPr>
+              <w:spacing w:after="0"/>
+            </w:pPr>
+            <w:r>
+              <w:rPr>
+                <w:rFonts w:ascii="Malgun Gothic" w:hAnsi="Malgun Gothic" w:eastAsia="Malgun Gothic"/>
+                <w:b w:val="0"/>
+                <w:sz w:val="23"/>
+              </w:rPr>
+              <w:t>새 홈페이지를 쓸지</w:t>
+            </w:r>
+          </w:p>
+        </w:tc>
+        <w:tc>
+          <w:tcPr>
+            <w:tcW w:type="dxa" w:w="7100"/>
+            <w:vAlign w:val="center"/>
+            <w:tcMar>
+              <w:top w:w="120" w:type="dxa"/>
+              <w:start w:w="140" w:type="dxa"/>
+              <w:bottom w:w="120" w:type="dxa"/>
+              <w:end w:w="140" w:type="dxa"/>
+            </w:tcMar>
+          </w:tcPr>
+          <w:p>
+            <w:pPr>
+              <w:spacing w:after="0"/>
+            </w:pPr>
+            <w:r>
+              <w:rPr>
+                <w:rFonts w:ascii="Malgun Gothic" w:hAnsi="Malgun Gothic" w:eastAsia="Malgun Gothic"/>
+                <w:b w:val="0"/>
+                <w:sz w:val="23"/>
+              </w:rPr>
+              <w:t>현재 아임웹 화면 대신 새 화면을 대표로 쓸지 결정합니다.</w:t>
+            </w:r>
+          </w:p>
+        </w:tc>
+      </w:tr>
+      <w:tr>
+        <w:tc>
+          <w:tcPr>
+            <w:tcW w:type="dxa" w:w="2500"/>
+            <w:vAlign w:val="center"/>
+            <w:tcMar>
+              <w:top w:w="120" w:type="dxa"/>
+              <w:start w:w="140" w:type="dxa"/>
+              <w:bottom w:w="120" w:type="dxa"/>
+              <w:end w:w="140" w:type="dxa"/>
+            </w:tcMar>
+          </w:tcPr>
+          <w:p>
+            <w:pPr>
+              <w:spacing w:after="0"/>
+            </w:pPr>
+            <w:r>
+              <w:rPr>
+                <w:rFonts w:ascii="Malgun Gothic" w:hAnsi="Malgun Gothic" w:eastAsia="Malgun Gothic"/>
+                <w:b w:val="0"/>
+                <w:sz w:val="23"/>
+              </w:rPr>
+              <w:t>언제 공개할지</w:t>
+            </w:r>
+          </w:p>
+        </w:tc>
+        <w:tc>
+          <w:tcPr>
+            <w:tcW w:type="dxa" w:w="7100"/>
+            <w:vAlign w:val="center"/>
+            <w:tcMar>
+              <w:top w:w="120" w:type="dxa"/>
+              <w:start w:w="140" w:type="dxa"/>
+              <w:bottom w:w="120" w:type="dxa"/>
+              <w:end w:w="140" w:type="dxa"/>
+            </w:tcMar>
+          </w:tcPr>
+          <w:p>
+            <w:pPr>
+              <w:spacing w:after="0"/>
+            </w:pPr>
+            <w:r>
+              <w:rPr>
+                <w:rFonts w:ascii="Malgun Gothic" w:hAnsi="Malgun Gothic" w:eastAsia="Malgun Gothic"/>
+                <w:b w:val="0"/>
+                <w:sz w:val="23"/>
+              </w:rPr>
+              <w:t>임시 주소로 먼저 확인한 뒤 공개 시점을 정합니다.</w:t>
+            </w:r>
+          </w:p>
+        </w:tc>
+      </w:tr>
+      <w:tr>
+        <w:tc>
+          <w:tcPr>
+            <w:tcW w:type="dxa" w:w="2500"/>
+            <w:vAlign w:val="center"/>
+            <w:tcMar>
+              <w:top w:w="120" w:type="dxa"/>
+              <w:start w:w="140" w:type="dxa"/>
+              <w:bottom w:w="120" w:type="dxa"/>
+              <w:end w:w="140" w:type="dxa"/>
+            </w:tcMar>
+          </w:tcPr>
+          <w:p>
+            <w:pPr>
+              <w:spacing w:after="0"/>
+            </w:pPr>
+            <w:r>
+              <w:rPr>
+                <w:rFonts w:ascii="Malgun Gothic" w:hAnsi="Malgun Gothic" w:eastAsia="Malgun Gothic"/>
+                <w:b w:val="0"/>
+                <w:sz w:val="23"/>
+              </w:rPr>
+              <w:t>도메인을 연결할지</w:t>
+            </w:r>
+          </w:p>
+        </w:tc>
+        <w:tc>
+          <w:tcPr>
+            <w:tcW w:type="dxa" w:w="7100"/>
+            <w:vAlign w:val="center"/>
+            <w:tcMar>
+              <w:top w:w="120" w:type="dxa"/>
+              <w:start w:w="140" w:type="dxa"/>
+              <w:bottom w:w="120" w:type="dxa"/>
+              <w:end w:w="140" w:type="dxa"/>
+            </w:tcMar>
+          </w:tcPr>
+          <w:p>
+            <w:pPr>
+              <w:spacing w:after="0"/>
+            </w:pPr>
+            <w:r>
+              <w:rPr>
+                <w:rFonts w:ascii="Malgun Gothic" w:hAnsi="Malgun Gothic" w:eastAsia="Malgun Gothic"/>
+                <w:b w:val="0"/>
+                <w:sz w:val="23"/>
+              </w:rPr>
+              <w:t>greenputt.kr을 새 홈페이지에 연결할지 결정합니다.</w:t>
+            </w:r>
+          </w:p>
+        </w:tc>
+      </w:tr>
+      <w:tr>
+        <w:tc>
+          <w:tcPr>
+            <w:tcW w:type="dxa" w:w="2500"/>
+            <w:vAlign w:val="center"/>
+            <w:tcMar>
+              <w:top w:w="120" w:type="dxa"/>
+              <w:start w:w="140" w:type="dxa"/>
+              <w:bottom w:w="120" w:type="dxa"/>
+              <w:end w:w="140" w:type="dxa"/>
+            </w:tcMar>
+          </w:tcPr>
+          <w:p>
+            <w:pPr>
+              <w:spacing w:after="0"/>
+            </w:pPr>
+            <w:r>
+              <w:rPr>
+                <w:rFonts w:ascii="Malgun Gothic" w:hAnsi="Malgun Gothic" w:eastAsia="Malgun Gothic"/>
+                <w:b w:val="0"/>
+                <w:sz w:val="23"/>
+              </w:rPr>
+              <w:t>계정 관리자를 정할지</w:t>
+            </w:r>
+          </w:p>
+        </w:tc>
+        <w:tc>
+          <w:tcPr>
+            <w:tcW w:type="dxa" w:w="7100"/>
+            <w:vAlign w:val="center"/>
+            <w:tcMar>
+              <w:top w:w="120" w:type="dxa"/>
+              <w:start w:w="140" w:type="dxa"/>
+              <w:bottom w:w="120" w:type="dxa"/>
+              <w:end w:w="140" w:type="dxa"/>
+            </w:tcMar>
+          </w:tcPr>
+          <w:p>
+            <w:pPr>
+              <w:spacing w:after="0"/>
+            </w:pPr>
+            <w:r>
+              <w:rPr>
+                <w:rFonts w:ascii="Malgun Gothic" w:hAnsi="Malgun Gothic" w:eastAsia="Malgun Gothic"/>
+                <w:b w:val="0"/>
+                <w:sz w:val="23"/>
+              </w:rPr>
+              <w:t>가비아와 아임웹 계정을 누가 관리할지 정합니다.</w:t>
             </w:r>
           </w:p>
         </w:tc>
@@ -342,245 +988,34 @@
         <w:pStyle w:val="Heading1"/>
       </w:pPr>
       <w:r>
-        <w:t>2. 이번 인수인계에 포함된 것</w:t>
-      </w:r>
-    </w:p>
-    <w:p>
-      <w:pPr>
-        <w:pStyle w:val="ListBullet"/>
-        <w:spacing w:after="160"/>
-        <w:ind w:left="720" w:hanging="360"/>
-      </w:pPr>
-      <w:r>
-        <w:rPr>
-          <w:rFonts w:ascii="Calibri" w:hAnsi="Calibri" w:eastAsia="Malgun Gothic"/>
-        </w:rPr>
-        <w:t>GreenPutt 홈페이지 소스 파일과 이미지/로고/파비콘</w:t>
-      </w:r>
-    </w:p>
-    <w:p>
-      <w:pPr>
-        <w:pStyle w:val="ListBullet"/>
-        <w:spacing w:after="160"/>
-        <w:ind w:left="720" w:hanging="360"/>
-      </w:pPr>
-      <w:r>
-        <w:rPr>
-          <w:rFonts w:ascii="Calibri" w:hAnsi="Calibri" w:eastAsia="Malgun Gothic"/>
-        </w:rPr>
-        <w:t>Polvert 장갑 구매 연결 구조</w:t>
-      </w:r>
-    </w:p>
-    <w:p>
-      <w:pPr>
-        <w:pStyle w:val="ListBullet"/>
-        <w:spacing w:after="160"/>
-        <w:ind w:left="720" w:hanging="360"/>
-      </w:pPr>
-      <w:r>
-        <w:rPr>
-          <w:rFonts w:ascii="Calibri" w:hAnsi="Calibri" w:eastAsia="Malgun Gothic"/>
-        </w:rPr>
-        <w:t>가비아 도메인/DNS 자료와 아임웹 도메인/SSL 참고 자료</w:t>
-      </w:r>
-    </w:p>
-    <w:p>
-      <w:pPr>
-        <w:pStyle w:val="ListBullet"/>
-        <w:spacing w:after="160"/>
-        <w:ind w:left="720" w:hanging="360"/>
-      </w:pPr>
-      <w:r>
-        <w:rPr>
-          <w:rFonts w:ascii="Calibri" w:hAnsi="Calibri" w:eastAsia="Malgun Gothic"/>
-        </w:rPr>
-        <w:t>구매안전서비스 이용확인증, 통신판매업신고증</w:t>
-      </w:r>
-    </w:p>
-    <w:p>
-      <w:pPr>
-        <w:pStyle w:val="ListBullet"/>
-        <w:spacing w:after="160"/>
-        <w:ind w:left="720" w:hanging="360"/>
-      </w:pPr>
-      <w:r>
-        <w:rPr>
-          <w:rFonts w:ascii="Calibri" w:hAnsi="Calibri" w:eastAsia="Malgun Gothic"/>
-        </w:rPr>
-        <w:t>Polvert 기존 제품 자료, 2026 신제품 촬영 자료, 작업 이미지/PSD/영상 자료</w:t>
-      </w:r>
-    </w:p>
-    <w:p>
-      <w:pPr>
-        <w:pStyle w:val="ListBullet"/>
-        <w:spacing w:after="160"/>
-        <w:ind w:left="720" w:hanging="360"/>
-      </w:pPr>
-      <w:r>
-        <w:rPr>
-          <w:rFonts w:ascii="Calibri" w:hAnsi="Calibri" w:eastAsia="Malgun Gothic"/>
-        </w:rPr>
-        <w:t>외주 담당자에게 바로 공유할 수 있는 06번 전달자료 폴더</w:t>
-      </w:r>
-    </w:p>
-    <w:p>
-      <w:pPr>
-        <w:pStyle w:val="Heading1"/>
-      </w:pPr>
-      <w:r>
-        <w:t>3. 배포가 필요한 이유</w:t>
-      </w:r>
-    </w:p>
-    <w:p>
-      <w:r>
-        <w:t>현재 소스 파일은 홈페이지를 만들 수 있는 원본 자료입니다. 하지만 ZIP 파일이나 소스 파일만 가지고는 고객이 인터넷에서 접속할 수 없습니다.</w:t>
-      </w:r>
-    </w:p>
-    <w:p>
-      <w:r>
-        <w:t>고객이 greenputt.kr 같은 주소로 홈페이지를 보려면 소스 파일을 인터넷 서버에 올리는 과정이 필요합니다. 이 과정을 배포라고 부릅니다.</w:t>
+        <w:t>7. 도메인 정보</w:t>
       </w:r>
     </w:p>
     <w:tbl>
       <w:tblPr>
         <w:tblStyle w:val="TableGrid"/>
-        <w:tblW w:type="dxa" w:w="9120"/>
-        <w:jc w:val="left"/>
+        <w:tblW w:type="dxa" w:w="9600"/>
         <w:tblLayout w:type="fixed"/>
         <w:tblLook w:firstColumn="1" w:firstRow="1" w:lastColumn="0" w:lastRow="0" w:noHBand="0" w:noVBand="1" w:val="04A0"/>
-        <w:tblInd w:w="120" w:type="dxa"/>
+        <w:jc w:val="left"/>
+        <w:tblInd w:w="80" w:type="dxa"/>
       </w:tblPr>
       <w:tblGrid>
-        <w:gridCol w:w="9120"/>
+        <w:gridCol w:w="2500"/>
+        <w:gridCol w:w="7100"/>
       </w:tblGrid>
       <w:tr>
         <w:tc>
           <w:tcPr>
-            <w:tcW w:type="dxa" w:w="9120"/>
+            <w:tcW w:type="dxa" w:w="2500"/>
             <w:vAlign w:val="center"/>
             <w:tcMar>
-              <w:top w:w="80" w:type="dxa"/>
-              <w:start w:w="120" w:type="dxa"/>
-              <w:bottom w:w="80" w:type="dxa"/>
-              <w:end w:w="120" w:type="dxa"/>
+              <w:top w:w="120" w:type="dxa"/>
+              <w:start w:w="140" w:type="dxa"/>
+              <w:bottom w:w="120" w:type="dxa"/>
+              <w:end w:w="140" w:type="dxa"/>
             </w:tcMar>
-            <w:shd w:fill="EAF2F8"/>
-          </w:tcPr>
-          <w:p>
-            <w:pPr>
-              <w:spacing w:after="80"/>
-            </w:pPr>
-            <w:r/>
-            <w:r>
-              <w:rPr>
-                <w:rFonts w:ascii="Calibri" w:hAnsi="Calibri" w:eastAsia="Malgun Gothic"/>
-                <w:b/>
-                <w:color w:val="1F4D78"/>
-              </w:rPr>
-              <w:t>쉽게 말하면</w:t>
-            </w:r>
-          </w:p>
-          <w:p>
-            <w:pPr>
-              <w:spacing w:after="0"/>
-            </w:pPr>
-            <w:r>
-              <w:rPr>
-                <w:rFonts w:ascii="Calibri" w:hAnsi="Calibri" w:eastAsia="Malgun Gothic"/>
-              </w:rPr>
-              <w:t>배포는 홈페이지를 “파일 상태”에서 “고객이 접속할 수 있는 웹사이트 상태”로 바꾸는 단계입니다.</w:t>
-            </w:r>
-          </w:p>
-        </w:tc>
-      </w:tr>
-    </w:tbl>
-    <w:p/>
-    <w:p>
-      <w:pPr>
-        <w:pStyle w:val="ListNumber"/>
-        <w:spacing w:after="160"/>
-        <w:ind w:left="720" w:hanging="360"/>
-      </w:pPr>
-      <w:r>
-        <w:rPr>
-          <w:rFonts w:ascii="Calibri" w:hAnsi="Calibri" w:eastAsia="Malgun Gothic"/>
-        </w:rPr>
-        <w:t>임시 주소에서 홈페이지가 정상적으로 보이는지 확인합니다.</w:t>
-      </w:r>
-    </w:p>
-    <w:p>
-      <w:pPr>
-        <w:pStyle w:val="ListNumber"/>
-        <w:spacing w:after="160"/>
-        <w:ind w:left="720" w:hanging="360"/>
-      </w:pPr>
-      <w:r>
-        <w:rPr>
-          <w:rFonts w:ascii="Calibri" w:hAnsi="Calibri" w:eastAsia="Malgun Gothic"/>
-        </w:rPr>
-        <w:t>Polvert 구매 버튼이 아임웹 상품/장바구니로 잘 연결되는지 확인합니다.</w:t>
-      </w:r>
-    </w:p>
-    <w:p>
-      <w:pPr>
-        <w:pStyle w:val="ListNumber"/>
-        <w:spacing w:after="160"/>
-        <w:ind w:left="720" w:hanging="360"/>
-      </w:pPr>
-      <w:r>
-        <w:rPr>
-          <w:rFonts w:ascii="Calibri" w:hAnsi="Calibri" w:eastAsia="Malgun Gothic"/>
-        </w:rPr>
-        <w:t>모바일과 PC 화면이 깨지지 않는지 확인합니다.</w:t>
-      </w:r>
-    </w:p>
-    <w:p>
-      <w:pPr>
-        <w:pStyle w:val="ListNumber"/>
-        <w:spacing w:after="160"/>
-        <w:ind w:left="720" w:hanging="360"/>
-      </w:pPr>
-      <w:r>
-        <w:rPr>
-          <w:rFonts w:ascii="Calibri" w:hAnsi="Calibri" w:eastAsia="Malgun Gothic"/>
-        </w:rPr>
-        <w:t>문제가 없으면 greenputt.kr 도메인 연결 여부를 결정합니다.</w:t>
-      </w:r>
-    </w:p>
-    <w:p>
-      <w:pPr>
-        <w:pStyle w:val="Heading1"/>
-      </w:pPr>
-      <w:r>
-        <w:t>4. 배포 선택지는 이렇게 보면 됩니다</w:t>
-      </w:r>
-    </w:p>
-    <w:tbl>
-      <w:tblPr>
-        <w:tblStyle w:val="TableGrid"/>
-        <w:tblW w:type="dxa" w:w="9320"/>
-        <w:tblLayout w:type="fixed"/>
-        <w:tblLook w:firstColumn="1" w:firstRow="1" w:lastColumn="0" w:lastRow="0" w:noHBand="0" w:noVBand="1" w:val="04A0"/>
-        <w:jc w:val="left"/>
-        <w:tblInd w:w="120" w:type="dxa"/>
-      </w:tblPr>
-      <w:tblGrid>
-        <w:gridCol w:w="1700"/>
-        <w:gridCol w:w="5000"/>
-        <w:gridCol w:w="2620"/>
-      </w:tblGrid>
-      <w:tr>
-        <w:tc>
-          <w:tcPr>
-            <w:tcW w:type="dxa" w:w="1700"/>
-            <w:vAlign w:val="center"/>
-            <w:tcMar>
-              <w:top w:w="80" w:type="dxa"/>
-              <w:start w:w="120" w:type="dxa"/>
-              <w:bottom w:w="80" w:type="dxa"/>
-              <w:end w:w="120" w:type="dxa"/>
-            </w:tcMar>
-            <w:shd w:fill="F2F4F7"/>
+            <w:shd w:fill="E7EEF6"/>
           </w:tcPr>
           <w:p>
             <w:pPr>
@@ -588,24 +1023,26 @@
             </w:pPr>
             <w:r>
               <w:rPr>
-                <w:rFonts w:ascii="Calibri" w:hAnsi="Calibri" w:eastAsia="Malgun Gothic"/>
+                <w:rFonts w:ascii="Malgun Gothic" w:hAnsi="Malgun Gothic" w:eastAsia="Malgun Gothic"/>
                 <w:b/>
+                <w:color w:val="1F3040"/>
+                <w:sz w:val="23"/>
               </w:rPr>
-              <w:t>선택지</w:t>
+              <w:t>항목</w:t>
             </w:r>
           </w:p>
         </w:tc>
         <w:tc>
           <w:tcPr>
-            <w:tcW w:type="dxa" w:w="5000"/>
+            <w:tcW w:type="dxa" w:w="7100"/>
             <w:vAlign w:val="center"/>
             <w:tcMar>
-              <w:top w:w="80" w:type="dxa"/>
-              <w:start w:w="120" w:type="dxa"/>
-              <w:bottom w:w="80" w:type="dxa"/>
-              <w:end w:w="120" w:type="dxa"/>
+              <w:top w:w="120" w:type="dxa"/>
+              <w:start w:w="140" w:type="dxa"/>
+              <w:bottom w:w="120" w:type="dxa"/>
+              <w:end w:w="140" w:type="dxa"/>
             </w:tcMar>
-            <w:shd w:fill="F2F4F7"/>
+            <w:shd w:fill="E7EEF6"/>
           </w:tcPr>
           <w:p>
             <w:pPr>
@@ -613,35 +1050,12 @@
             </w:pPr>
             <w:r>
               <w:rPr>
-                <w:rFonts w:ascii="Calibri" w:hAnsi="Calibri" w:eastAsia="Malgun Gothic"/>
+                <w:rFonts w:ascii="Malgun Gothic" w:hAnsi="Malgun Gothic" w:eastAsia="Malgun Gothic"/>
                 <w:b/>
+                <w:color w:val="1F3040"/>
+                <w:sz w:val="23"/>
               </w:rPr>
-              <w:t>설명</w:t>
-            </w:r>
-          </w:p>
-        </w:tc>
-        <w:tc>
-          <w:tcPr>
-            <w:tcW w:type="dxa" w:w="2620"/>
-            <w:vAlign w:val="center"/>
-            <w:tcMar>
-              <w:top w:w="80" w:type="dxa"/>
-              <w:start w:w="120" w:type="dxa"/>
-              <w:bottom w:w="80" w:type="dxa"/>
-              <w:end w:w="120" w:type="dxa"/>
-            </w:tcMar>
-            <w:shd w:fill="F2F4F7"/>
-          </w:tcPr>
-          <w:p>
-            <w:pPr>
-              <w:spacing w:after="0"/>
-            </w:pPr>
-            <w:r>
-              <w:rPr>
-                <w:rFonts w:ascii="Calibri" w:hAnsi="Calibri" w:eastAsia="Malgun Gothic"/>
-                <w:b/>
-              </w:rPr>
-              <w:t>추천 상황</w:t>
+              <w:t>내용</w:t>
             </w:r>
           </w:p>
         </w:tc>
@@ -649,13 +1063,13 @@
       <w:tr>
         <w:tc>
           <w:tcPr>
-            <w:tcW w:type="dxa" w:w="1700"/>
+            <w:tcW w:type="dxa" w:w="2500"/>
             <w:vAlign w:val="center"/>
             <w:tcMar>
-              <w:top w:w="80" w:type="dxa"/>
-              <w:start w:w="120" w:type="dxa"/>
-              <w:bottom w:w="80" w:type="dxa"/>
-              <w:end w:w="120" w:type="dxa"/>
+              <w:top w:w="120" w:type="dxa"/>
+              <w:start w:w="140" w:type="dxa"/>
+              <w:bottom w:w="120" w:type="dxa"/>
+              <w:end w:w="140" w:type="dxa"/>
             </w:tcMar>
           </w:tcPr>
           <w:p>
@@ -664,22 +1078,23 @@
             </w:pPr>
             <w:r>
               <w:rPr>
-                <w:rFonts w:ascii="Calibri" w:hAnsi="Calibri" w:eastAsia="Malgun Gothic"/>
-                <w:sz w:val="21"/>
+                <w:rFonts w:ascii="Malgun Gothic" w:hAnsi="Malgun Gothic" w:eastAsia="Malgun Gothic"/>
+                <w:b w:val="0"/>
+                <w:sz w:val="23"/>
               </w:rPr>
-              <w:t>Vercel</w:t>
+              <w:t>대표 도메인</w:t>
             </w:r>
           </w:p>
         </w:tc>
         <w:tc>
           <w:tcPr>
-            <w:tcW w:type="dxa" w:w="5000"/>
+            <w:tcW w:type="dxa" w:w="7100"/>
             <w:vAlign w:val="center"/>
             <w:tcMar>
-              <w:top w:w="80" w:type="dxa"/>
-              <w:start w:w="120" w:type="dxa"/>
-              <w:bottom w:w="80" w:type="dxa"/>
-              <w:end w:w="120" w:type="dxa"/>
+              <w:top w:w="120" w:type="dxa"/>
+              <w:start w:w="140" w:type="dxa"/>
+              <w:bottom w:w="120" w:type="dxa"/>
+              <w:end w:w="140" w:type="dxa"/>
             </w:tcMar>
           </w:tcPr>
           <w:p>
@@ -688,697 +1103,9 @@
             </w:pPr>
             <w:r>
               <w:rPr>
-                <w:rFonts w:ascii="Calibri" w:hAnsi="Calibri" w:eastAsia="Malgun Gothic"/>
-                <w:sz w:val="21"/>
-              </w:rPr>
-              <w:t>홈페이지를 올리고 임시 주소로 확인하기 편한 서비스</w:t>
-            </w:r>
-          </w:p>
-        </w:tc>
-        <w:tc>
-          <w:tcPr>
-            <w:tcW w:type="dxa" w:w="2620"/>
-            <w:vAlign w:val="center"/>
-            <w:tcMar>
-              <w:top w:w="80" w:type="dxa"/>
-              <w:start w:w="120" w:type="dxa"/>
-              <w:bottom w:w="80" w:type="dxa"/>
-              <w:end w:w="120" w:type="dxa"/>
-            </w:tcMar>
-          </w:tcPr>
-          <w:p>
-            <w:pPr>
-              <w:spacing w:after="0"/>
-            </w:pPr>
-            <w:r>
-              <w:rPr>
-                <w:rFonts w:ascii="Calibri" w:hAnsi="Calibri" w:eastAsia="Malgun Gothic"/>
-                <w:sz w:val="21"/>
-              </w:rPr>
-              <w:t>우선 검토 추천</w:t>
-            </w:r>
-          </w:p>
-        </w:tc>
-      </w:tr>
-      <w:tr>
-        <w:tc>
-          <w:tcPr>
-            <w:tcW w:type="dxa" w:w="1700"/>
-            <w:vAlign w:val="center"/>
-            <w:tcMar>
-              <w:top w:w="80" w:type="dxa"/>
-              <w:start w:w="120" w:type="dxa"/>
-              <w:bottom w:w="80" w:type="dxa"/>
-              <w:end w:w="120" w:type="dxa"/>
-            </w:tcMar>
-          </w:tcPr>
-          <w:p>
-            <w:pPr>
-              <w:spacing w:after="0"/>
-            </w:pPr>
-            <w:r>
-              <w:rPr>
-                <w:rFonts w:ascii="Calibri" w:hAnsi="Calibri" w:eastAsia="Malgun Gothic"/>
-                <w:sz w:val="21"/>
-              </w:rPr>
-              <w:t>GitHub Pages</w:t>
-            </w:r>
-          </w:p>
-        </w:tc>
-        <w:tc>
-          <w:tcPr>
-            <w:tcW w:type="dxa" w:w="5000"/>
-            <w:vAlign w:val="center"/>
-            <w:tcMar>
-              <w:top w:w="80" w:type="dxa"/>
-              <w:start w:w="120" w:type="dxa"/>
-              <w:bottom w:w="80" w:type="dxa"/>
-              <w:end w:w="120" w:type="dxa"/>
-            </w:tcMar>
-          </w:tcPr>
-          <w:p>
-            <w:pPr>
-              <w:spacing w:after="0"/>
-            </w:pPr>
-            <w:r>
-              <w:rPr>
-                <w:rFonts w:ascii="Calibri" w:hAnsi="Calibri" w:eastAsia="Malgun Gothic"/>
-                <w:sz w:val="21"/>
-              </w:rPr>
-              <w:t>Git 저장소를 이용해 정적 홈페이지를 올리는 방식</w:t>
-            </w:r>
-          </w:p>
-        </w:tc>
-        <w:tc>
-          <w:tcPr>
-            <w:tcW w:type="dxa" w:w="2620"/>
-            <w:vAlign w:val="center"/>
-            <w:tcMar>
-              <w:top w:w="80" w:type="dxa"/>
-              <w:start w:w="120" w:type="dxa"/>
-              <w:bottom w:w="80" w:type="dxa"/>
-              <w:end w:w="120" w:type="dxa"/>
-            </w:tcMar>
-          </w:tcPr>
-          <w:p>
-            <w:pPr>
-              <w:spacing w:after="0"/>
-            </w:pPr>
-            <w:r>
-              <w:rPr>
-                <w:rFonts w:ascii="Calibri" w:hAnsi="Calibri" w:eastAsia="Malgun Gothic"/>
-                <w:sz w:val="21"/>
-              </w:rPr>
-              <w:t>단순하게 운영하고 싶을 때 대안</w:t>
-            </w:r>
-          </w:p>
-        </w:tc>
-      </w:tr>
-    </w:tbl>
-    <w:p/>
-    <w:p>
-      <w:r>
-        <w:t>사장님이 직접 기술 설정을 하실 필요는 없습니다. 업체나 담당자에게 “Vercel을 우선 검토하고, 어려우면 GitHub Pages를 대안으로 검토해 달라”고 전달하면 됩니다.</w:t>
-      </w:r>
-    </w:p>
-    <w:p>
-      <w:pPr>
-        <w:pStyle w:val="Heading1"/>
-      </w:pPr>
-      <w:r>
-        <w:t>5. 사장님이 결정하면 좋은 것</w:t>
-      </w:r>
-    </w:p>
-    <w:tbl>
-      <w:tblPr>
-        <w:tblStyle w:val="TableGrid"/>
-        <w:tblW w:type="dxa" w:w="9320"/>
-        <w:tblLayout w:type="fixed"/>
-        <w:tblLook w:firstColumn="1" w:firstRow="1" w:lastColumn="0" w:lastRow="0" w:noHBand="0" w:noVBand="1" w:val="04A0"/>
-        <w:jc w:val="left"/>
-        <w:tblInd w:w="120" w:type="dxa"/>
-      </w:tblPr>
-      <w:tblGrid>
-        <w:gridCol w:w="2600"/>
-        <w:gridCol w:w="6720"/>
-      </w:tblGrid>
-      <w:tr>
-        <w:tc>
-          <w:tcPr>
-            <w:tcW w:type="dxa" w:w="2600"/>
-            <w:vAlign w:val="center"/>
-            <w:tcMar>
-              <w:top w:w="80" w:type="dxa"/>
-              <w:start w:w="120" w:type="dxa"/>
-              <w:bottom w:w="80" w:type="dxa"/>
-              <w:end w:w="120" w:type="dxa"/>
-            </w:tcMar>
-            <w:shd w:fill="F2F4F7"/>
-          </w:tcPr>
-          <w:p>
-            <w:pPr>
-              <w:spacing w:after="0"/>
-            </w:pPr>
-            <w:r>
-              <w:rPr>
-                <w:rFonts w:ascii="Calibri" w:hAnsi="Calibri" w:eastAsia="Malgun Gothic"/>
-                <w:b/>
-              </w:rPr>
-              <w:t>결정할 항목</w:t>
-            </w:r>
-          </w:p>
-        </w:tc>
-        <w:tc>
-          <w:tcPr>
-            <w:tcW w:type="dxa" w:w="6720"/>
-            <w:vAlign w:val="center"/>
-            <w:tcMar>
-              <w:top w:w="80" w:type="dxa"/>
-              <w:start w:w="120" w:type="dxa"/>
-              <w:bottom w:w="80" w:type="dxa"/>
-              <w:end w:w="120" w:type="dxa"/>
-            </w:tcMar>
-            <w:shd w:fill="F2F4F7"/>
-          </w:tcPr>
-          <w:p>
-            <w:pPr>
-              <w:spacing w:after="0"/>
-            </w:pPr>
-            <w:r>
-              <w:rPr>
-                <w:rFonts w:ascii="Calibri" w:hAnsi="Calibri" w:eastAsia="Malgun Gothic"/>
-                <w:b/>
-              </w:rPr>
-              <w:t>설명</w:t>
-            </w:r>
-          </w:p>
-        </w:tc>
-      </w:tr>
-      <w:tr>
-        <w:tc>
-          <w:tcPr>
-            <w:tcW w:type="dxa" w:w="2600"/>
-            <w:vAlign w:val="center"/>
-            <w:tcMar>
-              <w:top w:w="80" w:type="dxa"/>
-              <w:start w:w="120" w:type="dxa"/>
-              <w:bottom w:w="80" w:type="dxa"/>
-              <w:end w:w="120" w:type="dxa"/>
-            </w:tcMar>
-          </w:tcPr>
-          <w:p>
-            <w:pPr>
-              <w:spacing w:after="0"/>
-            </w:pPr>
-            <w:r>
-              <w:rPr>
-                <w:rFonts w:ascii="Calibri" w:hAnsi="Calibri" w:eastAsia="Malgun Gothic"/>
-                <w:sz w:val="21"/>
-              </w:rPr>
-              <w:t>새 홈페이지 반영 여부</w:t>
-            </w:r>
-          </w:p>
-        </w:tc>
-        <w:tc>
-          <w:tcPr>
-            <w:tcW w:type="dxa" w:w="6720"/>
-            <w:vAlign w:val="center"/>
-            <w:tcMar>
-              <w:top w:w="80" w:type="dxa"/>
-              <w:start w:w="120" w:type="dxa"/>
-              <w:bottom w:w="80" w:type="dxa"/>
-              <w:end w:w="120" w:type="dxa"/>
-            </w:tcMar>
-          </w:tcPr>
-          <w:p>
-            <w:pPr>
-              <w:spacing w:after="0"/>
-            </w:pPr>
-            <w:r>
-              <w:rPr>
-                <w:rFonts w:ascii="Calibri" w:hAnsi="Calibri" w:eastAsia="Malgun Gothic"/>
-                <w:sz w:val="21"/>
-              </w:rPr>
-              <w:t>현재 아임웹 화면을 유지할지, 커스텀 홈페이지를 새 대표 화면으로 쓸지 결정합니다.</w:t>
-            </w:r>
-          </w:p>
-        </w:tc>
-      </w:tr>
-      <w:tr>
-        <w:tc>
-          <w:tcPr>
-            <w:tcW w:type="dxa" w:w="2600"/>
-            <w:vAlign w:val="center"/>
-            <w:tcMar>
-              <w:top w:w="80" w:type="dxa"/>
-              <w:start w:w="120" w:type="dxa"/>
-              <w:bottom w:w="80" w:type="dxa"/>
-              <w:end w:w="120" w:type="dxa"/>
-            </w:tcMar>
-          </w:tcPr>
-          <w:p>
-            <w:pPr>
-              <w:spacing w:after="0"/>
-            </w:pPr>
-            <w:r>
-              <w:rPr>
-                <w:rFonts w:ascii="Calibri" w:hAnsi="Calibri" w:eastAsia="Malgun Gothic"/>
-                <w:sz w:val="21"/>
-              </w:rPr>
-              <w:t>배포 방식</w:t>
-            </w:r>
-          </w:p>
-        </w:tc>
-        <w:tc>
-          <w:tcPr>
-            <w:tcW w:type="dxa" w:w="6720"/>
-            <w:vAlign w:val="center"/>
-            <w:tcMar>
-              <w:top w:w="80" w:type="dxa"/>
-              <w:start w:w="120" w:type="dxa"/>
-              <w:bottom w:w="80" w:type="dxa"/>
-              <w:end w:w="120" w:type="dxa"/>
-            </w:tcMar>
-          </w:tcPr>
-          <w:p>
-            <w:pPr>
-              <w:spacing w:after="0"/>
-            </w:pPr>
-            <w:r>
-              <w:rPr>
-                <w:rFonts w:ascii="Calibri" w:hAnsi="Calibri" w:eastAsia="Malgun Gothic"/>
-                <w:sz w:val="21"/>
-              </w:rPr>
-              <w:t>Vercel 우선 검토, GitHub Pages 대안 중 업체 의견을 받아 결정합니다.</w:t>
-            </w:r>
-          </w:p>
-        </w:tc>
-      </w:tr>
-      <w:tr>
-        <w:tc>
-          <w:tcPr>
-            <w:tcW w:type="dxa" w:w="2600"/>
-            <w:vAlign w:val="center"/>
-            <w:tcMar>
-              <w:top w:w="80" w:type="dxa"/>
-              <w:start w:w="120" w:type="dxa"/>
-              <w:bottom w:w="80" w:type="dxa"/>
-              <w:end w:w="120" w:type="dxa"/>
-            </w:tcMar>
-          </w:tcPr>
-          <w:p>
-            <w:pPr>
-              <w:spacing w:after="0"/>
-            </w:pPr>
-            <w:r>
-              <w:rPr>
-                <w:rFonts w:ascii="Calibri" w:hAnsi="Calibri" w:eastAsia="Malgun Gothic"/>
-                <w:sz w:val="21"/>
-              </w:rPr>
-              <w:t>도메인 연결 시점</w:t>
-            </w:r>
-          </w:p>
-        </w:tc>
-        <w:tc>
-          <w:tcPr>
-            <w:tcW w:type="dxa" w:w="6720"/>
-            <w:vAlign w:val="center"/>
-            <w:tcMar>
-              <w:top w:w="80" w:type="dxa"/>
-              <w:start w:w="120" w:type="dxa"/>
-              <w:bottom w:w="80" w:type="dxa"/>
-              <w:end w:w="120" w:type="dxa"/>
-            </w:tcMar>
-          </w:tcPr>
-          <w:p>
-            <w:pPr>
-              <w:spacing w:after="0"/>
-            </w:pPr>
-            <w:r>
-              <w:rPr>
-                <w:rFonts w:ascii="Calibri" w:hAnsi="Calibri" w:eastAsia="Malgun Gothic"/>
-                <w:sz w:val="21"/>
-              </w:rPr>
-              <w:t>임시 주소 검수 후 greenputt.kr 연결 여부를 결정합니다.</w:t>
-            </w:r>
-          </w:p>
-        </w:tc>
-      </w:tr>
-      <w:tr>
-        <w:tc>
-          <w:tcPr>
-            <w:tcW w:type="dxa" w:w="2600"/>
-            <w:vAlign w:val="center"/>
-            <w:tcMar>
-              <w:top w:w="80" w:type="dxa"/>
-              <w:start w:w="120" w:type="dxa"/>
-              <w:bottom w:w="80" w:type="dxa"/>
-              <w:end w:w="120" w:type="dxa"/>
-            </w:tcMar>
-          </w:tcPr>
-          <w:p>
-            <w:pPr>
-              <w:spacing w:after="0"/>
-            </w:pPr>
-            <w:r>
-              <w:rPr>
-                <w:rFonts w:ascii="Calibri" w:hAnsi="Calibri" w:eastAsia="Malgun Gothic"/>
-                <w:sz w:val="21"/>
-              </w:rPr>
-              <w:t>계정 공유 범위</w:t>
-            </w:r>
-          </w:p>
-        </w:tc>
-        <w:tc>
-          <w:tcPr>
-            <w:tcW w:type="dxa" w:w="6720"/>
-            <w:vAlign w:val="center"/>
-            <w:tcMar>
-              <w:top w:w="80" w:type="dxa"/>
-              <w:start w:w="120" w:type="dxa"/>
-              <w:bottom w:w="80" w:type="dxa"/>
-              <w:end w:w="120" w:type="dxa"/>
-            </w:tcMar>
-          </w:tcPr>
-          <w:p>
-            <w:pPr>
-              <w:spacing w:after="0"/>
-            </w:pPr>
-            <w:r>
-              <w:rPr>
-                <w:rFonts w:ascii="Calibri" w:hAnsi="Calibri" w:eastAsia="Malgun Gothic"/>
-                <w:sz w:val="21"/>
-              </w:rPr>
-              <w:t>가비아/아임웹 계정을 누가 관리할지 정합니다.</w:t>
-            </w:r>
-          </w:p>
-        </w:tc>
-      </w:tr>
-      <w:tr>
-        <w:tc>
-          <w:tcPr>
-            <w:tcW w:type="dxa" w:w="2600"/>
-            <w:vAlign w:val="center"/>
-            <w:tcMar>
-              <w:top w:w="80" w:type="dxa"/>
-              <w:start w:w="120" w:type="dxa"/>
-              <w:bottom w:w="80" w:type="dxa"/>
-              <w:end w:w="120" w:type="dxa"/>
-            </w:tcMar>
-          </w:tcPr>
-          <w:p>
-            <w:pPr>
-              <w:spacing w:after="0"/>
-            </w:pPr>
-            <w:r>
-              <w:rPr>
-                <w:rFonts w:ascii="Calibri" w:hAnsi="Calibri" w:eastAsia="Malgun Gothic"/>
-                <w:sz w:val="21"/>
-              </w:rPr>
-              <w:t>Polvert 상품 정보</w:t>
-            </w:r>
-          </w:p>
-        </w:tc>
-        <w:tc>
-          <w:tcPr>
-            <w:tcW w:type="dxa" w:w="6720"/>
-            <w:vAlign w:val="center"/>
-            <w:tcMar>
-              <w:top w:w="80" w:type="dxa"/>
-              <w:start w:w="120" w:type="dxa"/>
-              <w:bottom w:w="80" w:type="dxa"/>
-              <w:end w:w="120" w:type="dxa"/>
-            </w:tcMar>
-          </w:tcPr>
-          <w:p>
-            <w:pPr>
-              <w:spacing w:after="0"/>
-            </w:pPr>
-            <w:r>
-              <w:rPr>
-                <w:rFonts w:ascii="Calibri" w:hAnsi="Calibri" w:eastAsia="Malgun Gothic"/>
-                <w:sz w:val="21"/>
-              </w:rPr>
-              <w:t>가격, 재고, 옵션, 대표 상품 URL이 맞는지 확인합니다.</w:t>
-            </w:r>
-          </w:p>
-        </w:tc>
-      </w:tr>
-      <w:tr>
-        <w:tc>
-          <w:tcPr>
-            <w:tcW w:type="dxa" w:w="2600"/>
-            <w:vAlign w:val="center"/>
-            <w:tcMar>
-              <w:top w:w="80" w:type="dxa"/>
-              <w:start w:w="120" w:type="dxa"/>
-              <w:bottom w:w="80" w:type="dxa"/>
-              <w:end w:w="120" w:type="dxa"/>
-            </w:tcMar>
-          </w:tcPr>
-          <w:p>
-            <w:pPr>
-              <w:spacing w:after="0"/>
-            </w:pPr>
-            <w:r>
-              <w:rPr>
-                <w:rFonts w:ascii="Calibri" w:hAnsi="Calibri" w:eastAsia="Malgun Gothic"/>
-                <w:sz w:val="21"/>
-              </w:rPr>
-              <w:t>공유 폴더 권한</w:t>
-            </w:r>
-          </w:p>
-        </w:tc>
-        <w:tc>
-          <w:tcPr>
-            <w:tcW w:type="dxa" w:w="6720"/>
-            <w:vAlign w:val="center"/>
-            <w:tcMar>
-              <w:top w:w="80" w:type="dxa"/>
-              <w:start w:w="120" w:type="dxa"/>
-              <w:bottom w:w="80" w:type="dxa"/>
-              <w:end w:w="120" w:type="dxa"/>
-            </w:tcMar>
-          </w:tcPr>
-          <w:p>
-            <w:pPr>
-              <w:spacing w:after="0"/>
-            </w:pPr>
-            <w:r>
-              <w:rPr>
-                <w:rFonts w:ascii="Calibri" w:hAnsi="Calibri" w:eastAsia="Malgun Gothic"/>
-                <w:sz w:val="21"/>
-              </w:rPr>
-              <w:t>내부용 01~05 전체를 공유할지, 외주용 06만 공유할지 정합니다.</w:t>
-            </w:r>
-          </w:p>
-        </w:tc>
-      </w:tr>
-    </w:tbl>
-    <w:p/>
-    <w:p>
-      <w:pPr>
-        <w:pStyle w:val="Heading1"/>
-      </w:pPr>
-      <w:r>
-        <w:t>6. 업체 또는 실무자가 이어서 할 일</w:t>
-      </w:r>
-    </w:p>
-    <w:p>
-      <w:pPr>
-        <w:pStyle w:val="ListNumber"/>
-        <w:spacing w:after="160"/>
-        <w:ind w:left="720" w:hanging="360"/>
-      </w:pPr>
-      <w:r>
-        <w:rPr>
-          <w:rFonts w:ascii="Calibri" w:hAnsi="Calibri" w:eastAsia="Malgun Gothic"/>
-        </w:rPr>
-        <w:t>외주 담당자는 06_외주_담당자_전달자료 폴더를 먼저 확인합니다.</w:t>
-      </w:r>
-    </w:p>
-    <w:p>
-      <w:pPr>
-        <w:pStyle w:val="ListNumber"/>
-        <w:spacing w:after="160"/>
-        <w:ind w:left="720" w:hanging="360"/>
-      </w:pPr>
-      <w:r>
-        <w:rPr>
-          <w:rFonts w:ascii="Calibri" w:hAnsi="Calibri" w:eastAsia="Malgun Gothic"/>
-        </w:rPr>
-        <w:t>소스 ZIP을 받아 압축을 풀고 홈페이지를 확인합니다.</w:t>
-      </w:r>
-    </w:p>
-    <w:p>
-      <w:pPr>
-        <w:pStyle w:val="ListNumber"/>
-        <w:spacing w:after="160"/>
-        <w:ind w:left="720" w:hanging="360"/>
-      </w:pPr>
-      <w:r>
-        <w:rPr>
-          <w:rFonts w:ascii="Calibri" w:hAnsi="Calibri" w:eastAsia="Malgun Gothic"/>
-        </w:rPr>
-        <w:t>Polvert 구매 버튼이 아임웹으로 정상 연결되는지 확인합니다.</w:t>
-      </w:r>
-    </w:p>
-    <w:p>
-      <w:pPr>
-        <w:pStyle w:val="ListNumber"/>
-        <w:spacing w:after="160"/>
-        <w:ind w:left="720" w:hanging="360"/>
-      </w:pPr>
-      <w:r>
-        <w:rPr>
-          <w:rFonts w:ascii="Calibri" w:hAnsi="Calibri" w:eastAsia="Malgun Gothic"/>
-        </w:rPr>
-        <w:t>Vercel 또는 GitHub Pages 중 배포 방식을 제안합니다.</w:t>
-      </w:r>
-    </w:p>
-    <w:p>
-      <w:pPr>
-        <w:pStyle w:val="ListNumber"/>
-        <w:spacing w:after="160"/>
-        <w:ind w:left="720" w:hanging="360"/>
-      </w:pPr>
-      <w:r>
-        <w:rPr>
-          <w:rFonts w:ascii="Calibri" w:hAnsi="Calibri" w:eastAsia="Malgun Gothic"/>
-        </w:rPr>
-        <w:t>임시 배포 주소를 사장님께 공유해 검수받습니다.</w:t>
-      </w:r>
-    </w:p>
-    <w:p>
-      <w:pPr>
-        <w:pStyle w:val="ListNumber"/>
-        <w:spacing w:after="160"/>
-        <w:ind w:left="720" w:hanging="360"/>
-      </w:pPr>
-      <w:r>
-        <w:rPr>
-          <w:rFonts w:ascii="Calibri" w:hAnsi="Calibri" w:eastAsia="Malgun Gothic"/>
-        </w:rPr>
-        <w:t>도메인 변경 전 현재 DNS 설정을 백업합니다.</w:t>
-      </w:r>
-    </w:p>
-    <w:p>
-      <w:pPr>
-        <w:pStyle w:val="Heading1"/>
-      </w:pPr>
-      <w:r>
-        <w:t>7. 도메인과 계정 정보</w:t>
-      </w:r>
-    </w:p>
-    <w:tbl>
-      <w:tblPr>
-        <w:tblStyle w:val="TableGrid"/>
-        <w:tblW w:type="dxa" w:w="9320"/>
-        <w:tblLayout w:type="fixed"/>
-        <w:tblLook w:firstColumn="1" w:firstRow="1" w:lastColumn="0" w:lastRow="0" w:noHBand="0" w:noVBand="1" w:val="04A0"/>
-        <w:jc w:val="left"/>
-        <w:tblInd w:w="120" w:type="dxa"/>
-      </w:tblPr>
-      <w:tblGrid>
-        <w:gridCol w:w="2600"/>
-        <w:gridCol w:w="6720"/>
-      </w:tblGrid>
-      <w:tr>
-        <w:tc>
-          <w:tcPr>
-            <w:tcW w:type="dxa" w:w="2600"/>
-            <w:vAlign w:val="center"/>
-            <w:tcMar>
-              <w:top w:w="80" w:type="dxa"/>
-              <w:start w:w="120" w:type="dxa"/>
-              <w:bottom w:w="80" w:type="dxa"/>
-              <w:end w:w="120" w:type="dxa"/>
-            </w:tcMar>
-            <w:shd w:fill="F2F4F7"/>
-          </w:tcPr>
-          <w:p>
-            <w:pPr>
-              <w:spacing w:after="0"/>
-            </w:pPr>
-            <w:r>
-              <w:rPr>
-                <w:rFonts w:ascii="Calibri" w:hAnsi="Calibri" w:eastAsia="Malgun Gothic"/>
-                <w:b/>
-              </w:rPr>
-              <w:t>항목</w:t>
-            </w:r>
-          </w:p>
-        </w:tc>
-        <w:tc>
-          <w:tcPr>
-            <w:tcW w:type="dxa" w:w="6720"/>
-            <w:vAlign w:val="center"/>
-            <w:tcMar>
-              <w:top w:w="80" w:type="dxa"/>
-              <w:start w:w="120" w:type="dxa"/>
-              <w:bottom w:w="80" w:type="dxa"/>
-              <w:end w:w="120" w:type="dxa"/>
-            </w:tcMar>
-            <w:shd w:fill="F2F4F7"/>
-          </w:tcPr>
-          <w:p>
-            <w:pPr>
-              <w:spacing w:after="0"/>
-            </w:pPr>
-            <w:r>
-              <w:rPr>
-                <w:rFonts w:ascii="Calibri" w:hAnsi="Calibri" w:eastAsia="Malgun Gothic"/>
-                <w:b/>
-              </w:rPr>
-              <w:t>현재 정보</w:t>
-            </w:r>
-          </w:p>
-        </w:tc>
-      </w:tr>
-      <w:tr>
-        <w:tc>
-          <w:tcPr>
-            <w:tcW w:type="dxa" w:w="2600"/>
-            <w:vAlign w:val="center"/>
-            <w:tcMar>
-              <w:top w:w="80" w:type="dxa"/>
-              <w:start w:w="120" w:type="dxa"/>
-              <w:bottom w:w="80" w:type="dxa"/>
-              <w:end w:w="120" w:type="dxa"/>
-            </w:tcMar>
-          </w:tcPr>
-          <w:p>
-            <w:pPr>
-              <w:spacing w:after="0"/>
-            </w:pPr>
-            <w:r>
-              <w:rPr>
-                <w:rFonts w:ascii="Calibri" w:hAnsi="Calibri" w:eastAsia="Malgun Gothic"/>
-                <w:sz w:val="21"/>
-              </w:rPr>
-              <w:t>대표 도메인</w:t>
-            </w:r>
-          </w:p>
-        </w:tc>
-        <w:tc>
-          <w:tcPr>
-            <w:tcW w:type="dxa" w:w="6720"/>
-            <w:vAlign w:val="center"/>
-            <w:tcMar>
-              <w:top w:w="80" w:type="dxa"/>
-              <w:start w:w="120" w:type="dxa"/>
-              <w:bottom w:w="80" w:type="dxa"/>
-              <w:end w:w="120" w:type="dxa"/>
-            </w:tcMar>
-          </w:tcPr>
-          <w:p>
-            <w:pPr>
-              <w:spacing w:after="0"/>
-            </w:pPr>
-            <w:r>
-              <w:rPr>
-                <w:rFonts w:ascii="Calibri" w:hAnsi="Calibri" w:eastAsia="Malgun Gothic"/>
-                <w:sz w:val="21"/>
+                <w:rFonts w:ascii="Malgun Gothic" w:hAnsi="Malgun Gothic" w:eastAsia="Malgun Gothic"/>
+                <w:b w:val="0"/>
+                <w:sz w:val="23"/>
               </w:rPr>
               <w:t>greenputt.kr</w:t>
             </w:r>
@@ -1388,13 +1115,13 @@
       <w:tr>
         <w:tc>
           <w:tcPr>
-            <w:tcW w:type="dxa" w:w="2600"/>
+            <w:tcW w:type="dxa" w:w="2500"/>
             <w:vAlign w:val="center"/>
             <w:tcMar>
-              <w:top w:w="80" w:type="dxa"/>
-              <w:start w:w="120" w:type="dxa"/>
-              <w:bottom w:w="80" w:type="dxa"/>
-              <w:end w:w="120" w:type="dxa"/>
+              <w:top w:w="120" w:type="dxa"/>
+              <w:start w:w="140" w:type="dxa"/>
+              <w:bottom w:w="120" w:type="dxa"/>
+              <w:end w:w="140" w:type="dxa"/>
             </w:tcMar>
           </w:tcPr>
           <w:p>
@@ -1403,8 +1130,9 @@
             </w:pPr>
             <w:r>
               <w:rPr>
-                <w:rFonts w:ascii="Calibri" w:hAnsi="Calibri" w:eastAsia="Malgun Gothic"/>
-                <w:sz w:val="21"/>
+                <w:rFonts w:ascii="Malgun Gothic" w:hAnsi="Malgun Gothic" w:eastAsia="Malgun Gothic"/>
+                <w:b w:val="0"/>
+                <w:sz w:val="23"/>
               </w:rPr>
               <w:t>보조 도메인</w:t>
             </w:r>
@@ -1412,13 +1140,13 @@
         </w:tc>
         <w:tc>
           <w:tcPr>
-            <w:tcW w:type="dxa" w:w="6720"/>
+            <w:tcW w:type="dxa" w:w="7100"/>
             <w:vAlign w:val="center"/>
             <w:tcMar>
-              <w:top w:w="80" w:type="dxa"/>
-              <w:start w:w="120" w:type="dxa"/>
-              <w:bottom w:w="80" w:type="dxa"/>
-              <w:end w:w="120" w:type="dxa"/>
+              <w:top w:w="120" w:type="dxa"/>
+              <w:start w:w="140" w:type="dxa"/>
+              <w:bottom w:w="120" w:type="dxa"/>
+              <w:end w:w="140" w:type="dxa"/>
             </w:tcMar>
           </w:tcPr>
           <w:p>
@@ -1427,8 +1155,9 @@
             </w:pPr>
             <w:r>
               <w:rPr>
-                <w:rFonts w:ascii="Calibri" w:hAnsi="Calibri" w:eastAsia="Malgun Gothic"/>
-                <w:sz w:val="21"/>
+                <w:rFonts w:ascii="Malgun Gothic" w:hAnsi="Malgun Gothic" w:eastAsia="Malgun Gothic"/>
+                <w:b w:val="0"/>
+                <w:sz w:val="23"/>
               </w:rPr>
               <w:t>그린펏.com</w:t>
             </w:r>
@@ -1438,13 +1167,13 @@
       <w:tr>
         <w:tc>
           <w:tcPr>
-            <w:tcW w:type="dxa" w:w="2600"/>
+            <w:tcW w:type="dxa" w:w="2500"/>
             <w:vAlign w:val="center"/>
             <w:tcMar>
-              <w:top w:w="80" w:type="dxa"/>
-              <w:start w:w="120" w:type="dxa"/>
-              <w:bottom w:w="80" w:type="dxa"/>
-              <w:end w:w="120" w:type="dxa"/>
+              <w:top w:w="120" w:type="dxa"/>
+              <w:start w:w="140" w:type="dxa"/>
+              <w:bottom w:w="120" w:type="dxa"/>
+              <w:end w:w="140" w:type="dxa"/>
             </w:tcMar>
           </w:tcPr>
           <w:p>
@@ -1453,22 +1182,23 @@
             </w:pPr>
             <w:r>
               <w:rPr>
-                <w:rFonts w:ascii="Calibri" w:hAnsi="Calibri" w:eastAsia="Malgun Gothic"/>
-                <w:sz w:val="21"/>
+                <w:rFonts w:ascii="Malgun Gothic" w:hAnsi="Malgun Gothic" w:eastAsia="Malgun Gothic"/>
+                <w:b w:val="0"/>
+                <w:sz w:val="23"/>
               </w:rPr>
-              <w:t>도메인 관리처</w:t>
+              <w:t>관리처</w:t>
             </w:r>
           </w:p>
         </w:tc>
         <w:tc>
           <w:tcPr>
-            <w:tcW w:type="dxa" w:w="6720"/>
+            <w:tcW w:type="dxa" w:w="7100"/>
             <w:vAlign w:val="center"/>
             <w:tcMar>
-              <w:top w:w="80" w:type="dxa"/>
-              <w:start w:w="120" w:type="dxa"/>
-              <w:bottom w:w="80" w:type="dxa"/>
-              <w:end w:w="120" w:type="dxa"/>
+              <w:top w:w="120" w:type="dxa"/>
+              <w:start w:w="140" w:type="dxa"/>
+              <w:bottom w:w="120" w:type="dxa"/>
+              <w:end w:w="140" w:type="dxa"/>
             </w:tcMar>
           </w:tcPr>
           <w:p>
@@ -1477,8 +1207,9 @@
             </w:pPr>
             <w:r>
               <w:rPr>
-                <w:rFonts w:ascii="Calibri" w:hAnsi="Calibri" w:eastAsia="Malgun Gothic"/>
-                <w:sz w:val="21"/>
+                <w:rFonts w:ascii="Malgun Gothic" w:hAnsi="Malgun Gothic" w:eastAsia="Malgun Gothic"/>
+                <w:b w:val="0"/>
+                <w:sz w:val="23"/>
               </w:rPr>
               <w:t>가비아</w:t>
             </w:r>
@@ -1488,13 +1219,13 @@
       <w:tr>
         <w:tc>
           <w:tcPr>
-            <w:tcW w:type="dxa" w:w="2600"/>
+            <w:tcW w:type="dxa" w:w="2500"/>
             <w:vAlign w:val="center"/>
             <w:tcMar>
-              <w:top w:w="80" w:type="dxa"/>
-              <w:start w:w="120" w:type="dxa"/>
-              <w:bottom w:w="80" w:type="dxa"/>
-              <w:end w:w="120" w:type="dxa"/>
+              <w:top w:w="120" w:type="dxa"/>
+              <w:start w:w="140" w:type="dxa"/>
+              <w:bottom w:w="120" w:type="dxa"/>
+              <w:end w:w="140" w:type="dxa"/>
             </w:tcMar>
           </w:tcPr>
           <w:p>
@@ -1503,22 +1234,23 @@
             </w:pPr>
             <w:r>
               <w:rPr>
-                <w:rFonts w:ascii="Calibri" w:hAnsi="Calibri" w:eastAsia="Malgun Gothic"/>
-                <w:sz w:val="21"/>
+                <w:rFonts w:ascii="Malgun Gothic" w:hAnsi="Malgun Gothic" w:eastAsia="Malgun Gothic"/>
+                <w:b w:val="0"/>
+                <w:sz w:val="23"/>
               </w:rPr>
-              <w:t>두 도메인 만료일</w:t>
+              <w:t>만료일</w:t>
             </w:r>
           </w:p>
         </w:tc>
         <w:tc>
           <w:tcPr>
-            <w:tcW w:type="dxa" w:w="6720"/>
+            <w:tcW w:type="dxa" w:w="7100"/>
             <w:vAlign w:val="center"/>
             <w:tcMar>
-              <w:top w:w="80" w:type="dxa"/>
-              <w:start w:w="120" w:type="dxa"/>
-              <w:bottom w:w="80" w:type="dxa"/>
-              <w:end w:w="120" w:type="dxa"/>
+              <w:top w:w="120" w:type="dxa"/>
+              <w:start w:w="140" w:type="dxa"/>
+              <w:bottom w:w="120" w:type="dxa"/>
+              <w:end w:w="140" w:type="dxa"/>
             </w:tcMar>
           </w:tcPr>
           <w:p>
@@ -1527,8 +1259,9 @@
             </w:pPr>
             <w:r>
               <w:rPr>
-                <w:rFonts w:ascii="Calibri" w:hAnsi="Calibri" w:eastAsia="Malgun Gothic"/>
-                <w:sz w:val="21"/>
+                <w:rFonts w:ascii="Malgun Gothic" w:hAnsi="Malgun Gothic" w:eastAsia="Malgun Gothic"/>
+                <w:b w:val="0"/>
+                <w:sz w:val="23"/>
               </w:rPr>
               <w:t>2035-12-19</w:t>
             </w:r>
@@ -1538,13 +1271,13 @@
       <w:tr>
         <w:tc>
           <w:tcPr>
-            <w:tcW w:type="dxa" w:w="2600"/>
+            <w:tcW w:type="dxa" w:w="2500"/>
             <w:vAlign w:val="center"/>
             <w:tcMar>
-              <w:top w:w="80" w:type="dxa"/>
-              <w:start w:w="120" w:type="dxa"/>
-              <w:bottom w:w="80" w:type="dxa"/>
-              <w:end w:w="120" w:type="dxa"/>
+              <w:top w:w="120" w:type="dxa"/>
+              <w:start w:w="140" w:type="dxa"/>
+              <w:bottom w:w="120" w:type="dxa"/>
+              <w:end w:w="140" w:type="dxa"/>
             </w:tcMar>
           </w:tcPr>
           <w:p>
@@ -1553,22 +1286,23 @@
             </w:pPr>
             <w:r>
               <w:rPr>
-                <w:rFonts w:ascii="Calibri" w:hAnsi="Calibri" w:eastAsia="Malgun Gothic"/>
-                <w:sz w:val="21"/>
+                <w:rFonts w:ascii="Malgun Gothic" w:hAnsi="Malgun Gothic" w:eastAsia="Malgun Gothic"/>
+                <w:b w:val="0"/>
+                <w:sz w:val="23"/>
               </w:rPr>
-              <w:t>아임웹 기본 주소</w:t>
+              <w:t>아임웹 주소</w:t>
             </w:r>
           </w:p>
         </w:tc>
         <w:tc>
           <w:tcPr>
-            <w:tcW w:type="dxa" w:w="6720"/>
+            <w:tcW w:type="dxa" w:w="7100"/>
             <w:vAlign w:val="center"/>
             <w:tcMar>
-              <w:top w:w="80" w:type="dxa"/>
-              <w:start w:w="120" w:type="dxa"/>
-              <w:bottom w:w="80" w:type="dxa"/>
-              <w:end w:w="120" w:type="dxa"/>
+              <w:top w:w="120" w:type="dxa"/>
+              <w:start w:w="140" w:type="dxa"/>
+              <w:bottom w:w="120" w:type="dxa"/>
+              <w:end w:w="140" w:type="dxa"/>
             </w:tcMar>
           </w:tcPr>
           <w:p>
@@ -1577,8 +1311,9 @@
             </w:pPr>
             <w:r>
               <w:rPr>
-                <w:rFonts w:ascii="Calibri" w:hAnsi="Calibri" w:eastAsia="Malgun Gothic"/>
-                <w:sz w:val="21"/>
+                <w:rFonts w:ascii="Malgun Gothic" w:hAnsi="Malgun Gothic" w:eastAsia="Malgun Gothic"/>
+                <w:b w:val="0"/>
+                <w:sz w:val="23"/>
               </w:rPr>
               <w:t>greenputt.imweb.me</w:t>
             </w:r>
@@ -1589,7 +1324,12 @@
     <w:p/>
     <w:p>
       <w:r>
-        <w:t>가비아와 아임웹 계정 정보는 별도 입력 양식에 빈칸으로 남겨두었습니다. 비밀번호는 공개 링크 폴더나 소스 ZIP에 저장하지 않는 것이 안전합니다.</w:t>
+        <w:rPr>
+          <w:rFonts w:ascii="Malgun Gothic" w:hAnsi="Malgun Gothic" w:eastAsia="Malgun Gothic"/>
+          <w:b w:val="0"/>
+          <w:sz w:val="25"/>
+        </w:rPr>
+        <w:t>도메인 설정을 바꾸기 전에는 현재 가비아 DNS 설정을 먼저 백업해야 합니다.</w:t>
       </w:r>
     </w:p>
     <w:p>
@@ -1597,182 +1337,114 @@
         <w:pStyle w:val="Heading1"/>
       </w:pPr>
       <w:r>
-        <w:t>8. Polvert 자료 주의사항</w:t>
+        <w:t>8. 상품 자료 주의사항</w:t>
       </w:r>
     </w:p>
     <w:p>
       <w:pPr>
         <w:pStyle w:val="ListBullet"/>
-        <w:spacing w:after="160"/>
-        <w:ind w:left="720" w:hanging="360"/>
+        <w:spacing w:after="140"/>
+        <w:ind w:left="504" w:hanging="259"/>
       </w:pPr>
       <w:r>
         <w:rPr>
-          <w:rFonts w:ascii="Calibri" w:hAnsi="Calibri" w:eastAsia="Malgun Gothic"/>
+          <w:rFonts w:ascii="Malgun Gothic" w:hAnsi="Malgun Gothic" w:eastAsia="Malgun Gothic"/>
+          <w:b w:val="0"/>
+          <w:sz w:val="25"/>
         </w:rPr>
-        <w:t>기존 판매 제품 자료는 2025년까지 판매했고 현재도 판매 중인 제품 자료입니다. 구형 로고가 포함된 경우가 많습니다.</w:t>
+        <w:t>Polvert 기존 제품 자료에는 구형 로고가 들어간 경우가 많습니다.</w:t>
       </w:r>
     </w:p>
     <w:p>
       <w:pPr>
         <w:pStyle w:val="ListBullet"/>
-        <w:spacing w:after="160"/>
-        <w:ind w:left="720" w:hanging="360"/>
+        <w:spacing w:after="140"/>
+        <w:ind w:left="504" w:hanging="259"/>
       </w:pPr>
       <w:r>
         <w:rPr>
-          <w:rFonts w:ascii="Calibri" w:hAnsi="Calibri" w:eastAsia="Malgun Gothic"/>
+          <w:rFonts w:ascii="Malgun Gothic" w:hAnsi="Malgun Gothic" w:eastAsia="Malgun Gothic"/>
+          <w:b w:val="0"/>
+          <w:sz w:val="25"/>
         </w:rPr>
-        <w:t>2026 신제품 실리콘 NEW 장갑 자료는 신형 로고가 들어간 촬영본입니다.</w:t>
+        <w:t>Polvert 2026 신제품 자료에는 신형 로고가 들어간 자료가 있습니다.</w:t>
       </w:r>
     </w:p>
     <w:p>
       <w:pPr>
         <w:pStyle w:val="ListBullet"/>
-        <w:spacing w:after="160"/>
-        <w:ind w:left="720" w:hanging="360"/>
+        <w:spacing w:after="140"/>
+        <w:ind w:left="504" w:hanging="259"/>
       </w:pPr>
       <w:r>
         <w:rPr>
-          <w:rFonts w:ascii="Calibri" w:hAnsi="Calibri" w:eastAsia="Malgun Gothic"/>
+          <w:rFonts w:ascii="Malgun Gothic" w:hAnsi="Malgun Gothic" w:eastAsia="Malgun Gothic"/>
+          <w:b w:val="0"/>
+          <w:sz w:val="25"/>
         </w:rPr>
-        <w:t>06번 외주 전달 폴더에는 Polvert 원본 ZIP, 작업 이미지, PSD, 영상 자료까지 포함됩니다.</w:t>
+        <w:t>그린펏_제품_구성도_참고자료 폴더의 이미지는 실제 촬영 사진이 아닙니다.</w:t>
       </w:r>
     </w:p>
     <w:p>
       <w:pPr>
         <w:pStyle w:val="ListBullet"/>
-        <w:spacing w:after="160"/>
-        <w:ind w:left="720" w:hanging="360"/>
+        <w:spacing w:after="140"/>
+        <w:ind w:left="504" w:hanging="259"/>
       </w:pPr>
       <w:r>
         <w:rPr>
-          <w:rFonts w:ascii="Calibri" w:hAnsi="Calibri" w:eastAsia="Malgun Gothic"/>
+          <w:rFonts w:ascii="Malgun Gothic" w:hAnsi="Malgun Gothic" w:eastAsia="Malgun Gothic"/>
+          <w:b w:val="0"/>
+          <w:sz w:val="25"/>
         </w:rPr>
-        <w:t>상세페이지나 상품 이미지를 수정할 때는 구형 로고와 신형 로고를 혼동하지 않도록 먼저 확인해야 합니다.</w:t>
-      </w:r>
-    </w:p>
-    <w:p>
-      <w:pPr>
-        <w:pStyle w:val="Heading1"/>
-      </w:pPr>
-      <w:r>
-        <w:t>9. 다음 진행 순서</w:t>
-      </w:r>
-    </w:p>
-    <w:p>
-      <w:pPr>
-        <w:pStyle w:val="ListNumber"/>
-        <w:spacing w:after="160"/>
-        <w:ind w:left="720" w:hanging="360"/>
-      </w:pPr>
-      <w:r>
-        <w:rPr>
-          <w:rFonts w:ascii="Calibri" w:hAnsi="Calibri" w:eastAsia="Malgun Gothic"/>
-        </w:rPr>
-        <w:t>내부 담당자는 01~05 폴더를 기준으로 전체 인수인계 자료를 확인합니다.</w:t>
-      </w:r>
-    </w:p>
-    <w:p>
-      <w:pPr>
-        <w:pStyle w:val="ListNumber"/>
-        <w:spacing w:after="160"/>
-        <w:ind w:left="720" w:hanging="360"/>
-      </w:pPr>
-      <w:r>
-        <w:rPr>
-          <w:rFonts w:ascii="Calibri" w:hAnsi="Calibri" w:eastAsia="Malgun Gothic"/>
-        </w:rPr>
-        <w:t>외주 담당자에게는 06_외주_담당자_전달자료 폴더를 우선 공유합니다.</w:t>
-      </w:r>
-    </w:p>
-    <w:p>
-      <w:pPr>
-        <w:pStyle w:val="ListNumber"/>
-        <w:spacing w:after="160"/>
-        <w:ind w:left="720" w:hanging="360"/>
-      </w:pPr>
-      <w:r>
-        <w:rPr>
-          <w:rFonts w:ascii="Calibri" w:hAnsi="Calibri" w:eastAsia="Malgun Gothic"/>
-        </w:rPr>
-        <w:t>가비아/아임웹 계정 정보는 별도 방식으로 전달합니다.</w:t>
-      </w:r>
-    </w:p>
-    <w:p>
-      <w:pPr>
-        <w:pStyle w:val="ListNumber"/>
-        <w:spacing w:after="160"/>
-        <w:ind w:left="720" w:hanging="360"/>
-      </w:pPr>
-      <w:r>
-        <w:rPr>
-          <w:rFonts w:ascii="Calibri" w:hAnsi="Calibri" w:eastAsia="Malgun Gothic"/>
-        </w:rPr>
-        <w:t>업체가 임시 배포 주소를 만들면 화면과 링크를 검수합니다.</w:t>
-      </w:r>
-    </w:p>
-    <w:p>
-      <w:pPr>
-        <w:pStyle w:val="ListNumber"/>
-        <w:spacing w:after="160"/>
-        <w:ind w:left="720" w:hanging="360"/>
-      </w:pPr>
-      <w:r>
-        <w:rPr>
-          <w:rFonts w:ascii="Calibri" w:hAnsi="Calibri" w:eastAsia="Malgun Gothic"/>
-        </w:rPr>
-        <w:t>이상이 없으면 운영 도메인 연결 여부를 결정합니다.</w:t>
+        <w:t>해당 이미지는 퍼터, 매트, 거리측정기 구성을 설명하기 위한 참고 이미지입니다.</w:t>
       </w:r>
     </w:p>
     <w:tbl>
       <w:tblPr>
         <w:tblStyle w:val="TableGrid"/>
-        <w:tblW w:type="dxa" w:w="9120"/>
+        <w:tblW w:type="dxa" w:w="9600"/>
         <w:jc w:val="left"/>
         <w:tblLayout w:type="fixed"/>
         <w:tblLook w:firstColumn="1" w:firstRow="1" w:lastColumn="0" w:lastRow="0" w:noHBand="0" w:noVBand="1" w:val="04A0"/>
-        <w:tblInd w:w="120" w:type="dxa"/>
+        <w:tblInd w:w="80" w:type="dxa"/>
       </w:tblPr>
       <w:tblGrid>
-        <w:gridCol w:w="9120"/>
+        <w:gridCol w:w="9600"/>
       </w:tblGrid>
       <w:tr>
         <w:tc>
           <w:tcPr>
-            <w:tcW w:type="dxa" w:w="9120"/>
+            <w:tcW w:type="dxa" w:w="9600"/>
             <w:vAlign w:val="center"/>
             <w:tcMar>
-              <w:top w:w="80" w:type="dxa"/>
-              <w:start w:w="120" w:type="dxa"/>
-              <w:bottom w:w="80" w:type="dxa"/>
-              <w:end w:w="120" w:type="dxa"/>
+              <w:top w:w="120" w:type="dxa"/>
+              <w:start w:w="140" w:type="dxa"/>
+              <w:bottom w:w="120" w:type="dxa"/>
+              <w:end w:w="140" w:type="dxa"/>
             </w:tcMar>
-            <w:shd w:fill="EAF2F8"/>
+            <w:shd w:fill="EEF5FB"/>
           </w:tcPr>
           <w:p>
-            <w:pPr>
-              <w:spacing w:after="80"/>
-            </w:pPr>
             <w:r/>
             <w:r>
               <w:rPr>
-                <w:rFonts w:ascii="Calibri" w:hAnsi="Calibri" w:eastAsia="Malgun Gothic"/>
+                <w:rFonts w:ascii="Malgun Gothic" w:hAnsi="Malgun Gothic" w:eastAsia="Malgun Gothic"/>
                 <w:b/>
-                <w:color w:val="1F4D78"/>
+                <w:color w:val="1D5C92"/>
+                <w:sz w:val="26"/>
               </w:rPr>
-              <w:t>가장 중요한 확인 순서</w:t>
+              <w:t>가장 안전한 순서</w:t>
             </w:r>
           </w:p>
           <w:p>
-            <w:pPr>
-              <w:spacing w:after="0"/>
-            </w:pPr>
             <w:r>
               <w:rPr>
-                <w:rFonts w:ascii="Calibri" w:hAnsi="Calibri" w:eastAsia="Malgun Gothic"/>
+                <w:rFonts w:ascii="Malgun Gothic" w:hAnsi="Malgun Gothic" w:eastAsia="Malgun Gothic"/>
+                <w:b w:val="0"/>
+                <w:sz w:val="25"/>
               </w:rPr>
-              <w:t>운영 도메인을 바로 바꾸지 않고, 임시 배포 주소에서 먼저 화면과 링크를 확인한 뒤 연결하는 것이 안전합니다.</w:t>
+              <w:t>먼저 임시 주소에서 화면을 확인하고, 문제가 없을 때 greenputt.kr에 연결하는 것이 안전합니다. 운영 주소를 바로 바꾸지 않는 것이 중요합니다.</w:t>
             </w:r>
           </w:p>
         </w:tc>
@@ -1782,7 +1454,7 @@
     <w:sectPr>
       <w:footerReference w:type="default" r:id="rId9"/>
       <w:pgSz w:w="12240" w:h="15840"/>
-      <w:pgMar w:top="1440" w:right="1440" w:bottom="1440" w:left="1440" w:header="720" w:footer="720" w:gutter="0"/>
+      <w:pgMar w:top="1224" w:right="1224" w:bottom="1224" w:left="1224" w:header="720" w:footer="720" w:gutter="0"/>
       <w:cols w:space="720"/>
       <w:docGrid w:linePitch="360"/>
     </w:sectPr>
@@ -1799,11 +1471,12 @@
     </w:pPr>
     <w:r>
       <w:rPr>
-        <w:rFonts w:ascii="Calibri" w:hAnsi="Calibri" w:eastAsia="Malgun Gothic"/>
-        <w:color w:val="5A6068"/>
-        <w:sz w:val="18"/>
-      </w:rPr>
-      <w:t>GreenPutt 웹사이트 인수인계 요약 문서 · 2026-06-10</w:t>
+        <w:rFonts w:ascii="Malgun Gothic" w:hAnsi="Malgun Gothic" w:eastAsia="Malgun Gothic"/>
+        <w:b w:val="0"/>
+        <w:color w:val="586069"/>
+        <w:sz w:val="19"/>
+      </w:rPr>
+      <w:t>GreenPutt 웹사이트 사장님용 요약 문서 · 2026-06-10</w:t>
     </w:r>
   </w:p>
 </w:ftr>
@@ -2173,11 +1846,11 @@
     <w:qFormat/>
     <w:rsid w:val="00FC693F"/>
     <w:pPr>
-      <w:spacing w:after="120" w:line="264" w:lineRule="auto"/>
+      <w:spacing w:line="293" w:lineRule="auto" w:after="160"/>
     </w:pPr>
     <w:rPr>
-      <w:rFonts w:ascii="Calibri" w:hAnsi="Calibri" w:eastAsia="Malgun Gothic"/>
-      <w:sz w:val="22"/>
+      <w:rFonts w:ascii="Malgun Gothic" w:hAnsi="Malgun Gothic" w:eastAsia="Malgun Gothic"/>
+      <w:sz w:val="25"/>
     </w:rPr>
   </w:style>
   <w:style w:type="paragraph" w:styleId="Header">
@@ -2235,15 +1908,15 @@
     <w:pPr>
       <w:keepNext/>
       <w:keepLines/>
-      <w:spacing w:before="320" w:after="160"/>
+      <w:spacing w:before="360" w:after="160"/>
       <w:outlineLvl w:val="0"/>
     </w:pPr>
     <w:rPr>
-      <w:rFonts w:asciiTheme="majorHAnsi" w:eastAsiaTheme="majorEastAsia" w:hAnsiTheme="majorHAnsi" w:cstheme="majorBidi" w:ascii="Calibri" w:hAnsi="Calibri" w:eastAsia="Malgun Gothic"/>
+      <w:rFonts w:asciiTheme="majorHAnsi" w:eastAsiaTheme="majorEastAsia" w:hAnsiTheme="majorHAnsi" w:cstheme="majorBidi" w:ascii="Malgun Gothic" w:hAnsi="Malgun Gothic" w:eastAsia="Malgun Gothic"/>
       <w:b/>
       <w:bCs/>
-      <w:color w:val="2E74B5"/>
-      <w:sz w:val="32"/>
+      <w:color w:val="1D5C92"/>
+      <w:sz w:val="34"/>
       <w:szCs w:val="28"/>
     </w:rPr>
   </w:style>
@@ -2263,11 +1936,11 @@
       <w:outlineLvl w:val="1"/>
     </w:pPr>
     <w:rPr>
-      <w:rFonts w:asciiTheme="majorHAnsi" w:eastAsiaTheme="majorEastAsia" w:hAnsiTheme="majorHAnsi" w:cstheme="majorBidi" w:ascii="Calibri" w:hAnsi="Calibri" w:eastAsia="Malgun Gothic"/>
+      <w:rFonts w:asciiTheme="majorHAnsi" w:eastAsiaTheme="majorEastAsia" w:hAnsiTheme="majorHAnsi" w:cstheme="majorBidi" w:ascii="Malgun Gothic" w:hAnsi="Malgun Gothic" w:eastAsia="Malgun Gothic"/>
       <w:b/>
       <w:bCs/>
-      <w:color w:val="2E74B5"/>
-      <w:sz w:val="26"/>
+      <w:color w:val="1D5C92"/>
+      <w:sz w:val="28"/>
       <w:szCs w:val="26"/>
     </w:rPr>
   </w:style>
@@ -2287,11 +1960,11 @@
       <w:outlineLvl w:val="2"/>
     </w:pPr>
     <w:rPr>
-      <w:rFonts w:asciiTheme="majorHAnsi" w:eastAsiaTheme="majorEastAsia" w:hAnsiTheme="majorHAnsi" w:cstheme="majorBidi" w:ascii="Calibri" w:hAnsi="Calibri" w:eastAsia="Malgun Gothic"/>
+      <w:rFonts w:asciiTheme="majorHAnsi" w:eastAsiaTheme="majorEastAsia" w:hAnsiTheme="majorHAnsi" w:cstheme="majorBidi" w:ascii="Malgun Gothic" w:hAnsi="Malgun Gothic" w:eastAsia="Malgun Gothic"/>
       <w:b/>
       <w:bCs/>
-      <w:color w:val="1F4D78"/>
-      <w:sz w:val="24"/>
+      <w:color w:val="1F3040"/>
+      <w:sz w:val="26"/>
     </w:rPr>
   </w:style>
   <w:style w:type="paragraph" w:styleId="Heading4">

</xml_diff>